<commit_message>
Updated the Dynamic Analysis Report (formatting / license / process diagram)
</commit_message>
<xml_diff>
--- a/source/reference_documents/secondary_documents/implementation phase/Dynamic Analysis Report/Dynamic Analysis Report.docx
+++ b/source/reference_documents/secondary_documents/implementation phase/Dynamic Analysis Report/Dynamic Analysis Report.docx
@@ -1,6 +1,6 @@
 
 <file path=word/document.xml><?xml version="1.0" encoding="utf-8"?>
-<w:document xmlns:wpc="http://schemas.microsoft.com/office/word/2010/wordprocessingCanvas" xmlns:cx="http://schemas.microsoft.com/office/drawing/2014/chartex" xmlns:cx1="http://schemas.microsoft.com/office/drawing/2015/9/8/chartex" xmlns:cx2="http://schemas.microsoft.com/office/drawing/2015/10/21/chartex" xmlns:cx3="http://schemas.microsoft.com/office/drawing/2016/5/9/chartex" xmlns:cx4="http://schemas.microsoft.com/office/drawing/2016/5/10/chartex" xmlns:cx5="http://schemas.microsoft.com/office/drawing/2016/5/11/chartex" xmlns:cx6="http://schemas.microsoft.com/office/drawing/2016/5/12/chartex" xmlns:cx7="http://schemas.microsoft.com/office/drawing/2016/5/13/chartex" xmlns:cx8="http://schemas.microsoft.com/office/drawing/2016/5/14/chartex" xmlns:mc="http://schemas.openxmlformats.org/markup-compatibility/2006" xmlns:aink="http://schemas.microsoft.com/office/drawing/2016/ink" xmlns:am3d="http://schemas.microsoft.com/office/drawing/2017/model3d" xmlns:o="urn:schemas-microsoft-com:office:office" xmlns:oel="http://schemas.microsoft.com/office/2019/extlst" xmlns:r="http://schemas.openxmlformats.org/officeDocument/2006/relationships" xmlns:m="http://schemas.openxmlformats.org/officeDocument/2006/math" xmlns:v="urn:schemas-microsoft-com:vml" xmlns:wp14="http://schemas.microsoft.com/office/word/2010/wordprocessingDrawing" xmlns:wp="http://schemas.openxmlformats.org/drawingml/2006/wordprocessingDrawing" xmlns:w10="urn:schemas-microsoft-com:office:word" xmlns:w="http://schemas.openxmlformats.org/wordprocessingml/2006/main" xmlns:w14="http://schemas.microsoft.com/office/word/2010/wordml" xmlns:w15="http://schemas.microsoft.com/office/word/2012/wordml" xmlns:w16cex="http://schemas.microsoft.com/office/word/2018/wordml/cex" xmlns:w16cid="http://schemas.microsoft.com/office/word/2016/wordml/cid" xmlns:w16="http://schemas.microsoft.com/office/word/2018/wordml" xmlns:w16sdtdh="http://schemas.microsoft.com/office/word/2020/wordml/sdtdatahash" xmlns:w16se="http://schemas.microsoft.com/office/word/2015/wordml/symex" xmlns:wpg="http://schemas.microsoft.com/office/word/2010/wordprocessingGroup" xmlns:wpi="http://schemas.microsoft.com/office/word/2010/wordprocessingInk" xmlns:wne="http://schemas.microsoft.com/office/word/2006/wordml" xmlns:wps="http://schemas.microsoft.com/office/word/2010/wordprocessingShape" mc:Ignorable="w14 w15 w16se w16cid w16 w16cex w16sdtdh wp14">
+<w:document xmlns:wpc="http://schemas.microsoft.com/office/word/2010/wordprocessingCanvas" xmlns:cx="http://schemas.microsoft.com/office/drawing/2014/chartex" xmlns:cx1="http://schemas.microsoft.com/office/drawing/2015/9/8/chartex" xmlns:cx2="http://schemas.microsoft.com/office/drawing/2015/10/21/chartex" xmlns:cx3="http://schemas.microsoft.com/office/drawing/2016/5/9/chartex" xmlns:cx4="http://schemas.microsoft.com/office/drawing/2016/5/10/chartex" xmlns:cx5="http://schemas.microsoft.com/office/drawing/2016/5/11/chartex" xmlns:cx6="http://schemas.microsoft.com/office/drawing/2016/5/12/chartex" xmlns:cx7="http://schemas.microsoft.com/office/drawing/2016/5/13/chartex" xmlns:cx8="http://schemas.microsoft.com/office/drawing/2016/5/14/chartex" xmlns:mc="http://schemas.openxmlformats.org/markup-compatibility/2006" xmlns:aink="http://schemas.microsoft.com/office/drawing/2016/ink" xmlns:am3d="http://schemas.microsoft.com/office/drawing/2017/model3d" xmlns:o="urn:schemas-microsoft-com:office:office" xmlns:oel="http://schemas.microsoft.com/office/2019/extlst" xmlns:r="http://schemas.openxmlformats.org/officeDocument/2006/relationships" xmlns:m="http://schemas.openxmlformats.org/officeDocument/2006/math" xmlns:v="urn:schemas-microsoft-com:vml" xmlns:wp14="http://schemas.microsoft.com/office/word/2010/wordprocessingDrawing" xmlns:wp="http://schemas.openxmlformats.org/drawingml/2006/wordprocessingDrawing" xmlns:w10="urn:schemas-microsoft-com:office:word" xmlns:w="http://schemas.openxmlformats.org/wordprocessingml/2006/main" xmlns:w14="http://schemas.microsoft.com/office/word/2010/wordml" xmlns:w15="http://schemas.microsoft.com/office/word/2012/wordml" xmlns:w16cex="http://schemas.microsoft.com/office/word/2018/wordml/cex" xmlns:w16cid="http://schemas.microsoft.com/office/word/2016/wordml/cid" xmlns:w16="http://schemas.microsoft.com/office/word/2018/wordml" xmlns:w16du="http://schemas.microsoft.com/office/word/2023/wordml/word16du" xmlns:w16sdtdh="http://schemas.microsoft.com/office/word/2020/wordml/sdtdatahash" xmlns:w16sdtfl="http://schemas.microsoft.com/office/word/2024/wordml/sdtformatlock" xmlns:w16se="http://schemas.microsoft.com/office/word/2015/wordml/symex" xmlns:wpg="http://schemas.microsoft.com/office/word/2010/wordprocessingGroup" xmlns:wpi="http://schemas.microsoft.com/office/word/2010/wordprocessingInk" xmlns:wne="http://schemas.microsoft.com/office/word/2006/wordml" xmlns:wps="http://schemas.microsoft.com/office/word/2010/wordprocessingShape" mc:Ignorable="w14 w15 w16se w16cid w16 w16cex w16sdtdh w16sdtfl w16du wp14">
   <w:body>
     <w:p>
       <w:pPr>
@@ -24,11 +24,14 @@
       </w:r>
     </w:p>
     <w:p>
+      <w:pPr>
+        <w:spacing w:after="0"/>
+      </w:pPr>
       <w:r>
         <w:t xml:space="preserve">Version </w:t>
       </w:r>
       <w:r>
-        <w:t>3</w:t>
+        <w:t>4</w:t>
       </w:r>
     </w:p>
     <w:p>
@@ -45,7 +48,7 @@
         <w:rPr>
           <w:noProof/>
         </w:rPr>
-        <w:t>9/8/23 12:24 PM</w:t>
+        <w:t>8/15/25 9:18 AM</w:t>
       </w:r>
       <w:r>
         <w:fldChar w:fldCharType="end"/>
@@ -61,13 +64,18 @@
     </w:p>
     <w:p>
       <w:pPr>
-        <w:jc w:val="both"/>
+        <w:spacing w:after="0"/>
       </w:pPr>
       <w:r>
         <w:t>Matthew Bourdua</w:t>
       </w:r>
     </w:p>
     <w:p>
+      <w:r>
+        <w:t>Charles Wilson</w:t>
+      </w:r>
+    </w:p>
+    <w:p>
       <w:pPr>
         <w:pStyle w:val="Heading1"/>
       </w:pPr>
@@ -76,9 +84,6 @@
       </w:r>
     </w:p>
     <w:p>
-      <w:pPr>
-        <w:jc w:val="both"/>
-      </w:pPr>
       <w:r>
         <w:t xml:space="preserve">This document describes the </w:t>
       </w:r>
@@ -98,7 +103,6 @@
     <w:p>
       <w:pPr>
         <w:pStyle w:val="Heading1"/>
-        <w:jc w:val="both"/>
       </w:pPr>
       <w:bookmarkStart w:id="2" w:name="_54bgemmh6zb8" w:colFirst="0" w:colLast="0"/>
       <w:bookmarkEnd w:id="2"/>
@@ -107,9 +111,6 @@
       </w:r>
     </w:p>
     <w:p>
-      <w:pPr>
-        <w:jc w:val="both"/>
-      </w:pPr>
       <w:r>
         <w:t>Development</w:t>
       </w:r>
@@ -123,7 +124,6 @@
     <w:p>
       <w:pPr>
         <w:pStyle w:val="Heading1"/>
-        <w:jc w:val="both"/>
       </w:pPr>
       <w:bookmarkStart w:id="3" w:name="_olcs7d4b90ea" w:colFirst="0" w:colLast="0"/>
       <w:bookmarkEnd w:id="3"/>
@@ -132,11 +132,14 @@
       </w:r>
     </w:p>
     <w:p>
-      <w:pPr>
-        <w:jc w:val="both"/>
-      </w:pPr>
-      <w:r>
-        <w:t xml:space="preserve">This document is motivated by the need to have runtime-specific, security-related feedback in the development of software for use within safety-critical, cyber-physical systems for certification of compliance to standards such as </w:t>
+      <w:r>
+        <w:t xml:space="preserve">This document is motivated by the need to have runtime-specific, </w:t>
+      </w:r>
+      <w:r>
+        <w:t>cyber</w:t>
+      </w:r>
+      <w:r>
+        <w:t xml:space="preserve">security-related feedback in the development of software for use within safety-critical, cyber-physical systems for certification of compliance to standards such as </w:t>
       </w:r>
       <w:r>
         <w:rPr>
@@ -183,7 +186,6 @@
     <w:p>
       <w:pPr>
         <w:pStyle w:val="Heading1"/>
-        <w:jc w:val="both"/>
       </w:pPr>
       <w:bookmarkStart w:id="4" w:name="_f5diy2ktdyyf" w:colFirst="0" w:colLast="0"/>
       <w:bookmarkEnd w:id="4"/>
@@ -192,53 +194,67 @@
       </w:r>
     </w:p>
     <w:p>
-      <w:pPr>
-        <w:jc w:val="both"/>
-      </w:pPr>
-      <w:r>
-        <w:rPr>
-          <w:lang w:val="en-US"/>
-        </w:rPr>
+      <w:r>
         <w:t xml:space="preserve">This work </w:t>
       </w:r>
       <w:r>
-        <w:rPr>
-          <w:lang w:val="en-US"/>
-        </w:rPr>
-        <w:t xml:space="preserve">was created by </w:t>
-      </w:r>
-      <w:r>
-        <w:rPr>
-          <w:b/>
-          <w:bCs/>
-          <w:lang w:val="en-US"/>
+        <w:t xml:space="preserve">was </w:t>
+      </w:r>
+      <w:r>
+        <w:t xml:space="preserve">originally </w:t>
+      </w:r>
+      <w:r>
+        <w:t xml:space="preserve">created by </w:t>
+      </w:r>
+      <w:r>
+        <w:rPr>
+          <w:b/>
+          <w:bCs/>
         </w:rPr>
         <w:t>Motional</w:t>
       </w:r>
       <w:r>
-        <w:rPr>
-          <w:lang w:val="en-US"/>
-        </w:rPr>
         <w:t xml:space="preserve"> and </w:t>
       </w:r>
       <w:r>
-        <w:rPr>
-          <w:lang w:val="en-US"/>
-        </w:rPr>
         <w:t xml:space="preserve">is licensed under the </w:t>
       </w:r>
       <w:r>
         <w:rPr>
           <w:b/>
           <w:bCs/>
-          <w:lang w:val="en-US"/>
-        </w:rPr>
-        <w:t>Creative Commons Attribution-Share Alike (CC4-SA)</w:t>
-      </w:r>
-      <w:r>
-        <w:rPr>
-          <w:lang w:val="en-US"/>
-        </w:rPr>
+        </w:rPr>
+        <w:t>Creative Commons Attribution-Share Alike (CC</w:t>
+      </w:r>
+      <w:r>
+        <w:rPr>
+          <w:b/>
+          <w:bCs/>
+        </w:rPr>
+        <w:t xml:space="preserve"> BY</w:t>
+      </w:r>
+      <w:r>
+        <w:rPr>
+          <w:b/>
+          <w:bCs/>
+        </w:rPr>
+        <w:t>-SA</w:t>
+      </w:r>
+      <w:r>
+        <w:rPr>
+          <w:b/>
+          <w:bCs/>
+        </w:rPr>
+        <w:t>-4.0</w:t>
+      </w:r>
+      <w:r>
+        <w:rPr>
+          <w:b/>
+          <w:bCs/>
+        </w:rPr>
+        <w:t>)</w:t>
+      </w:r>
+      <w:r>
         <w:t xml:space="preserve"> License</w:t>
       </w:r>
       <w:r>
@@ -248,7 +264,6 @@
     <w:p>
       <w:pPr>
         <w:pStyle w:val="FirstParagraph"/>
-        <w:jc w:val="both"/>
       </w:pPr>
       <w:hyperlink r:id="rId7" w:history="1">
         <w:r>
@@ -283,15 +298,14 @@
       </w:r>
     </w:p>
     <w:p>
-      <w:pPr>
-        <w:spacing w:after="240"/>
-        <w:jc w:val="both"/>
-      </w:pPr>
       <w:r>
         <w:t xml:space="preserve">Although the quality of </w:t>
       </w:r>
       <w:r>
-        <w:t xml:space="preserve">security-related </w:t>
+        <w:t>cybersecurity</w:t>
+      </w:r>
+      <w:r>
+        <w:t xml:space="preserve">-related </w:t>
       </w:r>
       <w:r>
         <w:t xml:space="preserve">feedback from the compiler and static analysis tools </w:t>
@@ -312,14 +326,16 @@
         <w:t>dynamic analysis</w:t>
       </w:r>
       <w:r>
-        <w:t xml:space="preserve"> is very helpful in identifying security-related issues.</w:t>
-      </w:r>
-    </w:p>
-    <w:p>
-      <w:pPr>
-        <w:spacing w:after="240"/>
-        <w:jc w:val="both"/>
-      </w:pPr>
+        <w:t xml:space="preserve"> is very helpful in identifying </w:t>
+      </w:r>
+      <w:r>
+        <w:t>cybersecurity</w:t>
+      </w:r>
+      <w:r>
+        <w:t>-related issues.</w:t>
+      </w:r>
+    </w:p>
+    <w:p>
       <w:bookmarkStart w:id="5" w:name="_ka2wojif16d2" w:colFirst="0" w:colLast="0"/>
       <w:bookmarkEnd w:id="5"/>
       <w:r>
@@ -338,8 +354,8 @@
           <w:noProof/>
         </w:rPr>
         <w:drawing>
-          <wp:inline distT="0" distB="0" distL="0" distR="0" wp14:anchorId="4A5E8C84" wp14:editId="6F156EFF">
-            <wp:extent cx="5943600" cy="2050762"/>
+          <wp:inline distT="0" distB="0" distL="0" distR="0" wp14:anchorId="4A5E8C84" wp14:editId="4550AD15">
+            <wp:extent cx="5943600" cy="1906437"/>
             <wp:effectExtent l="0" t="0" r="0" b="0"/>
             <wp:docPr id="1" name="Picture 1"/>
             <wp:cNvGraphicFramePr>
@@ -367,7 +383,7 @@
                   <pic:spPr>
                     <a:xfrm>
                       <a:off x="0" y="0"/>
-                      <a:ext cx="5943600" cy="2050762"/>
+                      <a:ext cx="5943600" cy="1906437"/>
                     </a:xfrm>
                     <a:prstGeom prst="rect">
                       <a:avLst/>
@@ -397,7 +413,10 @@
         <w:pStyle w:val="Heading2"/>
       </w:pPr>
       <w:r>
-        <w:t>Establish Settings</w:t>
+        <w:t xml:space="preserve">Establish </w:t>
+      </w:r>
+      <w:r>
+        <w:t>Settings</w:t>
       </w:r>
     </w:p>
     <w:tbl>
@@ -422,7 +441,6 @@
         <w:tc>
           <w:tcPr>
             <w:tcW w:w="1520" w:type="dxa"/>
-            <w:shd w:val="clear" w:color="auto" w:fill="auto"/>
             <w:tcMar>
               <w:top w:w="100" w:type="dxa"/>
               <w:left w:w="100" w:type="dxa"/>
@@ -441,7 +459,7 @@
                 <w:right w:val="nil"/>
                 <w:between w:val="nil"/>
               </w:pBdr>
-              <w:spacing w:line="240" w:lineRule="auto"/>
+              <w:spacing w:after="0" w:line="240" w:lineRule="auto"/>
               <w:jc w:val="right"/>
               <w:rPr>
                 <w:b/>
@@ -460,7 +478,6 @@
         <w:tc>
           <w:tcPr>
             <w:tcW w:w="3780" w:type="dxa"/>
-            <w:shd w:val="clear" w:color="auto" w:fill="auto"/>
             <w:tcMar>
               <w:top w:w="100" w:type="dxa"/>
               <w:left w:w="100" w:type="dxa"/>
@@ -470,15 +487,7 @@
           </w:tcPr>
           <w:p>
             <w:pPr>
-              <w:widowControl w:val="0"/>
-              <w:pBdr>
-                <w:top w:val="nil"/>
-                <w:left w:val="nil"/>
-                <w:bottom w:val="nil"/>
-                <w:right w:val="nil"/>
-                <w:between w:val="nil"/>
-              </w:pBdr>
-              <w:spacing w:line="240" w:lineRule="auto"/>
+              <w:spacing w:after="0"/>
             </w:pPr>
             <w:r>
               <w:t>Build file</w:t>
@@ -486,15 +495,7 @@
           </w:p>
           <w:p>
             <w:pPr>
-              <w:widowControl w:val="0"/>
-              <w:pBdr>
-                <w:top w:val="nil"/>
-                <w:left w:val="nil"/>
-                <w:bottom w:val="nil"/>
-                <w:right w:val="nil"/>
-                <w:between w:val="nil"/>
-              </w:pBdr>
-              <w:spacing w:line="240" w:lineRule="auto"/>
+              <w:spacing w:after="0"/>
             </w:pPr>
             <w:r>
               <w:t>Element</w:t>
@@ -502,15 +503,7 @@
           </w:p>
           <w:p>
             <w:pPr>
-              <w:widowControl w:val="0"/>
-              <w:pBdr>
-                <w:top w:val="nil"/>
-                <w:left w:val="nil"/>
-                <w:bottom w:val="nil"/>
-                <w:right w:val="nil"/>
-                <w:between w:val="nil"/>
-              </w:pBdr>
-              <w:spacing w:line="240" w:lineRule="auto"/>
+              <w:spacing w:after="0"/>
             </w:pPr>
             <w:r>
               <w:t>Tool documentation</w:t>
@@ -522,7 +515,6 @@
         <w:tc>
           <w:tcPr>
             <w:tcW w:w="1520" w:type="dxa"/>
-            <w:shd w:val="clear" w:color="auto" w:fill="auto"/>
             <w:tcMar>
               <w:top w:w="100" w:type="dxa"/>
               <w:left w:w="100" w:type="dxa"/>
@@ -541,7 +533,7 @@
                 <w:right w:val="nil"/>
                 <w:between w:val="nil"/>
               </w:pBdr>
-              <w:spacing w:line="240" w:lineRule="auto"/>
+              <w:spacing w:after="0" w:line="240" w:lineRule="auto"/>
               <w:jc w:val="right"/>
               <w:rPr>
                 <w:b/>
@@ -560,7 +552,6 @@
         <w:tc>
           <w:tcPr>
             <w:tcW w:w="3780" w:type="dxa"/>
-            <w:shd w:val="clear" w:color="auto" w:fill="auto"/>
             <w:tcMar>
               <w:top w:w="100" w:type="dxa"/>
               <w:left w:w="100" w:type="dxa"/>
@@ -570,15 +561,7 @@
           </w:tcPr>
           <w:p>
             <w:pPr>
-              <w:widowControl w:val="0"/>
-              <w:pBdr>
-                <w:top w:val="nil"/>
-                <w:left w:val="nil"/>
-                <w:bottom w:val="nil"/>
-                <w:right w:val="nil"/>
-                <w:between w:val="nil"/>
-              </w:pBdr>
-              <w:spacing w:line="240" w:lineRule="auto"/>
+              <w:spacing w:after="0"/>
             </w:pPr>
             <w:r>
               <w:t>Updated build file</w:t>
@@ -586,15 +569,7 @@
           </w:p>
           <w:p>
             <w:pPr>
-              <w:widowControl w:val="0"/>
-              <w:pBdr>
-                <w:top w:val="nil"/>
-                <w:left w:val="nil"/>
-                <w:bottom w:val="nil"/>
-                <w:right w:val="nil"/>
-                <w:between w:val="nil"/>
-              </w:pBdr>
-              <w:spacing w:line="240" w:lineRule="auto"/>
+              <w:spacing w:after="0"/>
             </w:pPr>
             <w:r>
               <w:t>Security options qualification report</w:t>
@@ -606,7 +581,6 @@
         <w:tc>
           <w:tcPr>
             <w:tcW w:w="1520" w:type="dxa"/>
-            <w:shd w:val="clear" w:color="auto" w:fill="auto"/>
             <w:tcMar>
               <w:top w:w="100" w:type="dxa"/>
               <w:left w:w="100" w:type="dxa"/>
@@ -625,7 +599,7 @@
                 <w:right w:val="nil"/>
                 <w:between w:val="nil"/>
               </w:pBdr>
-              <w:spacing w:line="240" w:lineRule="auto"/>
+              <w:spacing w:after="0" w:line="240" w:lineRule="auto"/>
               <w:jc w:val="right"/>
               <w:rPr>
                 <w:b/>
@@ -644,7 +618,6 @@
         <w:tc>
           <w:tcPr>
             <w:tcW w:w="3780" w:type="dxa"/>
-            <w:shd w:val="clear" w:color="auto" w:fill="auto"/>
             <w:tcMar>
               <w:top w:w="100" w:type="dxa"/>
               <w:left w:w="100" w:type="dxa"/>
@@ -654,15 +627,7 @@
           </w:tcPr>
           <w:p>
             <w:pPr>
-              <w:widowControl w:val="0"/>
-              <w:pBdr>
-                <w:top w:val="nil"/>
-                <w:left w:val="nil"/>
-                <w:bottom w:val="nil"/>
-                <w:right w:val="nil"/>
-                <w:between w:val="nil"/>
-              </w:pBdr>
-              <w:spacing w:line="240" w:lineRule="auto"/>
+              <w:spacing w:after="0"/>
             </w:pPr>
             <w:r>
               <w:t>Development SME</w:t>
@@ -670,15 +635,7 @@
           </w:p>
           <w:p>
             <w:pPr>
-              <w:widowControl w:val="0"/>
-              <w:pBdr>
-                <w:top w:val="nil"/>
-                <w:left w:val="nil"/>
-                <w:bottom w:val="nil"/>
-                <w:right w:val="nil"/>
-                <w:between w:val="nil"/>
-              </w:pBdr>
-              <w:spacing w:line="240" w:lineRule="auto"/>
+              <w:spacing w:after="0"/>
             </w:pPr>
             <w:r>
               <w:t>Security SME</w:t>
@@ -686,15 +643,7 @@
           </w:p>
           <w:p>
             <w:pPr>
-              <w:widowControl w:val="0"/>
-              <w:pBdr>
-                <w:top w:val="nil"/>
-                <w:left w:val="nil"/>
-                <w:bottom w:val="nil"/>
-                <w:right w:val="nil"/>
-                <w:between w:val="nil"/>
-              </w:pBdr>
-              <w:spacing w:line="240" w:lineRule="auto"/>
+              <w:spacing w:after="0"/>
             </w:pPr>
             <w:r>
               <w:t>DevOps SME</w:t>
@@ -713,9 +662,9 @@
           <w:noProof/>
         </w:rPr>
         <w:drawing>
-          <wp:inline distT="0" distB="0" distL="0" distR="0" wp14:anchorId="5244CBE1" wp14:editId="76C87037">
-            <wp:extent cx="3786909" cy="4388006"/>
-            <wp:effectExtent l="0" t="0" r="0" b="0"/>
+          <wp:inline distT="0" distB="0" distL="0" distR="0" wp14:anchorId="5244CBE1" wp14:editId="590238FA">
+            <wp:extent cx="3793530" cy="4397047"/>
+            <wp:effectExtent l="0" t="0" r="3810" b="0"/>
             <wp:docPr id="2" name="Picture 2"/>
             <wp:cNvGraphicFramePr>
               <a:graphicFrameLocks xmlns:a="http://schemas.openxmlformats.org/drawingml/2006/main" noChangeAspect="1"/>
@@ -728,7 +677,7 @@
                     <pic:cNvPicPr/>
                   </pic:nvPicPr>
                   <pic:blipFill>
-                    <a:blip r:embed="rId9">
+                    <a:blip r:embed="rId9" cstate="print">
                       <a:extLst>
                         <a:ext uri="{28A0092B-C50C-407E-A947-70E740481C1C}">
                           <a14:useLocalDpi xmlns:a14="http://schemas.microsoft.com/office/drawing/2010/main" val="0"/>
@@ -742,7 +691,7 @@
                   <pic:spPr>
                     <a:xfrm>
                       <a:off x="0" y="0"/>
-                      <a:ext cx="3791386" cy="4393194"/>
+                      <a:ext cx="3793530" cy="4397047"/>
                     </a:xfrm>
                     <a:prstGeom prst="rect">
                       <a:avLst/>
@@ -757,15 +706,12 @@
     </w:p>
     <w:p/>
     <w:p>
-      <w:pPr>
-        <w:spacing w:after="240"/>
-        <w:jc w:val="both"/>
-      </w:pPr>
       <w:bookmarkStart w:id="6" w:name="_ggw3skhp9e8j" w:colFirst="0" w:colLast="0"/>
       <w:bookmarkStart w:id="7" w:name="_7ztzcq2uoqzj" w:colFirst="0" w:colLast="0"/>
       <w:bookmarkEnd w:id="6"/>
       <w:bookmarkEnd w:id="7"/>
       <w:r>
+        <w:lastRenderedPageBreak/>
         <w:t xml:space="preserve">Using the </w:t>
       </w:r>
       <w:r>
@@ -833,11 +779,7 @@
         <w:t>]</w:t>
       </w:r>
       <w:r>
-        <w:t xml:space="preserve"> process to determine what element aspect needs to be tested and </w:t>
-      </w:r>
-      <w:r>
-        <w:lastRenderedPageBreak/>
-        <w:t xml:space="preserve">whether the element will require any kind of instrumentation to enable that testing. An </w:t>
+        <w:t xml:space="preserve"> process to determine what element aspect needs to be tested and whether the element will require any kind of instrumentation to enable that testing. An </w:t>
       </w:r>
       <w:r>
         <w:rPr>
@@ -901,7 +843,6 @@
     <w:p>
       <w:pPr>
         <w:ind w:left="720" w:hanging="720"/>
-        <w:jc w:val="both"/>
         <w:rPr>
           <w:sz w:val="32"/>
           <w:szCs w:val="32"/>
@@ -954,7 +895,6 @@
         <w:tc>
           <w:tcPr>
             <w:tcW w:w="1520" w:type="dxa"/>
-            <w:shd w:val="clear" w:color="auto" w:fill="auto"/>
             <w:tcMar>
               <w:top w:w="100" w:type="dxa"/>
               <w:left w:w="100" w:type="dxa"/>
@@ -973,7 +913,7 @@
                 <w:right w:val="nil"/>
                 <w:between w:val="nil"/>
               </w:pBdr>
-              <w:spacing w:line="240" w:lineRule="auto"/>
+              <w:spacing w:after="0" w:line="240" w:lineRule="auto"/>
               <w:jc w:val="right"/>
               <w:rPr>
                 <w:b/>
@@ -992,7 +932,6 @@
         <w:tc>
           <w:tcPr>
             <w:tcW w:w="2610" w:type="dxa"/>
-            <w:shd w:val="clear" w:color="auto" w:fill="auto"/>
             <w:tcMar>
               <w:top w:w="100" w:type="dxa"/>
               <w:left w:w="100" w:type="dxa"/>
@@ -1010,7 +949,7 @@
                 <w:right w:val="nil"/>
                 <w:between w:val="nil"/>
               </w:pBdr>
-              <w:spacing w:line="240" w:lineRule="auto"/>
+              <w:spacing w:after="0" w:line="240" w:lineRule="auto"/>
             </w:pPr>
             <w:r>
               <w:t>Updated build file</w:t>
@@ -1022,7 +961,6 @@
         <w:tc>
           <w:tcPr>
             <w:tcW w:w="1520" w:type="dxa"/>
-            <w:shd w:val="clear" w:color="auto" w:fill="auto"/>
             <w:tcMar>
               <w:top w:w="100" w:type="dxa"/>
               <w:left w:w="100" w:type="dxa"/>
@@ -1041,7 +979,7 @@
                 <w:right w:val="nil"/>
                 <w:between w:val="nil"/>
               </w:pBdr>
-              <w:spacing w:line="240" w:lineRule="auto"/>
+              <w:spacing w:after="0" w:line="240" w:lineRule="auto"/>
               <w:jc w:val="right"/>
               <w:rPr>
                 <w:b/>
@@ -1060,7 +998,6 @@
         <w:tc>
           <w:tcPr>
             <w:tcW w:w="2610" w:type="dxa"/>
-            <w:shd w:val="clear" w:color="auto" w:fill="auto"/>
             <w:tcMar>
               <w:top w:w="100" w:type="dxa"/>
               <w:left w:w="100" w:type="dxa"/>
@@ -1078,7 +1015,7 @@
                 <w:right w:val="nil"/>
                 <w:between w:val="nil"/>
               </w:pBdr>
-              <w:spacing w:line="240" w:lineRule="auto"/>
+              <w:spacing w:after="0" w:line="240" w:lineRule="auto"/>
             </w:pPr>
             <w:r>
               <w:t>Instrumented element</w:t>
@@ -1090,7 +1027,6 @@
         <w:tc>
           <w:tcPr>
             <w:tcW w:w="1520" w:type="dxa"/>
-            <w:shd w:val="clear" w:color="auto" w:fill="auto"/>
             <w:tcMar>
               <w:top w:w="100" w:type="dxa"/>
               <w:left w:w="100" w:type="dxa"/>
@@ -1109,7 +1045,7 @@
                 <w:right w:val="nil"/>
                 <w:between w:val="nil"/>
               </w:pBdr>
-              <w:spacing w:line="240" w:lineRule="auto"/>
+              <w:spacing w:after="0" w:line="240" w:lineRule="auto"/>
               <w:jc w:val="right"/>
               <w:rPr>
                 <w:b/>
@@ -1128,7 +1064,6 @@
         <w:tc>
           <w:tcPr>
             <w:tcW w:w="2610" w:type="dxa"/>
-            <w:shd w:val="clear" w:color="auto" w:fill="auto"/>
             <w:tcMar>
               <w:top w:w="100" w:type="dxa"/>
               <w:left w:w="100" w:type="dxa"/>
@@ -1146,7 +1081,7 @@
                 <w:right w:val="nil"/>
                 <w:between w:val="nil"/>
               </w:pBdr>
-              <w:spacing w:line="240" w:lineRule="auto"/>
+              <w:spacing w:after="0" w:line="240" w:lineRule="auto"/>
               <w:rPr>
                 <w:b/>
                 <w:bCs/>
@@ -1173,9 +1108,9 @@
           <w:noProof/>
         </w:rPr>
         <w:drawing>
-          <wp:inline distT="0" distB="0" distL="0" distR="0" wp14:anchorId="53B2FBF4" wp14:editId="74DB71DE">
-            <wp:extent cx="3626548" cy="4401820"/>
-            <wp:effectExtent l="0" t="0" r="5715" b="5080"/>
+          <wp:inline distT="0" distB="0" distL="0" distR="0" wp14:anchorId="53B2FBF4" wp14:editId="293E6054">
+            <wp:extent cx="4571831" cy="4391025"/>
+            <wp:effectExtent l="0" t="0" r="635" b="3175"/>
             <wp:docPr id="3" name="Picture 3"/>
             <wp:cNvGraphicFramePr>
               <a:graphicFrameLocks xmlns:a="http://schemas.openxmlformats.org/drawingml/2006/main" noChangeAspect="1"/>
@@ -1188,7 +1123,7 @@
                     <pic:cNvPicPr/>
                   </pic:nvPicPr>
                   <pic:blipFill>
-                    <a:blip r:embed="rId10">
+                    <a:blip r:embed="rId10" cstate="print">
                       <a:extLst>
                         <a:ext uri="{28A0092B-C50C-407E-A947-70E740481C1C}">
                           <a14:useLocalDpi xmlns:a14="http://schemas.microsoft.com/office/drawing/2010/main" val="0"/>
@@ -1202,7 +1137,7 @@
                   <pic:spPr>
                     <a:xfrm>
                       <a:off x="0" y="0"/>
-                      <a:ext cx="3632797" cy="4409405"/>
+                      <a:ext cx="4603140" cy="4421096"/>
                     </a:xfrm>
                     <a:prstGeom prst="rect">
                       <a:avLst/>
@@ -1217,9 +1152,6 @@
     </w:p>
     <w:p/>
     <w:p>
-      <w:pPr>
-        <w:jc w:val="both"/>
-      </w:pPr>
       <w:r>
         <w:t>Using</w:t>
       </w:r>
@@ -1283,6 +1215,19 @@
       </w:r>
       <w:r>
         <w:t xml:space="preserve">he build system </w:t>
+      </w:r>
+      <w:r>
+        <w:t xml:space="preserve">takes the </w:t>
+      </w:r>
+      <w:r>
+        <w:rPr>
+          <w:b/>
+          <w:bCs/>
+        </w:rPr>
+        <w:t>Element</w:t>
+      </w:r>
+      <w:r>
+        <w:t xml:space="preserve"> and </w:t>
       </w:r>
       <w:r>
         <w:t>creates</w:t>
@@ -1367,7 +1312,6 @@
         <w:tc>
           <w:tcPr>
             <w:tcW w:w="1520" w:type="dxa"/>
-            <w:shd w:val="clear" w:color="auto" w:fill="auto"/>
             <w:tcMar>
               <w:top w:w="100" w:type="dxa"/>
               <w:left w:w="100" w:type="dxa"/>
@@ -1386,7 +1330,7 @@
                 <w:right w:val="nil"/>
                 <w:between w:val="nil"/>
               </w:pBdr>
-              <w:spacing w:line="240" w:lineRule="auto"/>
+              <w:spacing w:after="0" w:line="240" w:lineRule="auto"/>
               <w:jc w:val="right"/>
               <w:rPr>
                 <w:b/>
@@ -1405,7 +1349,6 @@
         <w:tc>
           <w:tcPr>
             <w:tcW w:w="2610" w:type="dxa"/>
-            <w:shd w:val="clear" w:color="auto" w:fill="auto"/>
             <w:tcMar>
               <w:top w:w="100" w:type="dxa"/>
               <w:left w:w="100" w:type="dxa"/>
@@ -1423,7 +1366,7 @@
                 <w:right w:val="nil"/>
                 <w:between w:val="nil"/>
               </w:pBdr>
-              <w:spacing w:line="240" w:lineRule="auto"/>
+              <w:spacing w:after="0" w:line="240" w:lineRule="auto"/>
             </w:pPr>
             <w:r>
               <w:t>Instrumented element</w:t>
@@ -1435,7 +1378,6 @@
         <w:tc>
           <w:tcPr>
             <w:tcW w:w="1520" w:type="dxa"/>
-            <w:shd w:val="clear" w:color="auto" w:fill="auto"/>
             <w:tcMar>
               <w:top w:w="100" w:type="dxa"/>
               <w:left w:w="100" w:type="dxa"/>
@@ -1454,7 +1396,7 @@
                 <w:right w:val="nil"/>
                 <w:between w:val="nil"/>
               </w:pBdr>
-              <w:spacing w:line="240" w:lineRule="auto"/>
+              <w:spacing w:after="0" w:line="240" w:lineRule="auto"/>
               <w:jc w:val="right"/>
               <w:rPr>
                 <w:b/>
@@ -1473,7 +1415,6 @@
         <w:tc>
           <w:tcPr>
             <w:tcW w:w="2610" w:type="dxa"/>
-            <w:shd w:val="clear" w:color="auto" w:fill="auto"/>
             <w:tcMar>
               <w:top w:w="100" w:type="dxa"/>
               <w:left w:w="100" w:type="dxa"/>
@@ -1491,7 +1432,7 @@
                 <w:right w:val="nil"/>
                 <w:between w:val="nil"/>
               </w:pBdr>
-              <w:spacing w:line="240" w:lineRule="auto"/>
+              <w:spacing w:after="0" w:line="240" w:lineRule="auto"/>
             </w:pPr>
             <w:r>
               <w:t>Dynamic analysis output</w:t>
@@ -1503,7 +1444,6 @@
         <w:tc>
           <w:tcPr>
             <w:tcW w:w="1520" w:type="dxa"/>
-            <w:shd w:val="clear" w:color="auto" w:fill="auto"/>
             <w:tcMar>
               <w:top w:w="100" w:type="dxa"/>
               <w:left w:w="100" w:type="dxa"/>
@@ -1522,7 +1462,7 @@
                 <w:right w:val="nil"/>
                 <w:between w:val="nil"/>
               </w:pBdr>
-              <w:spacing w:line="240" w:lineRule="auto"/>
+              <w:spacing w:after="0" w:line="240" w:lineRule="auto"/>
               <w:jc w:val="right"/>
               <w:rPr>
                 <w:b/>
@@ -1541,7 +1481,6 @@
         <w:tc>
           <w:tcPr>
             <w:tcW w:w="2610" w:type="dxa"/>
-            <w:shd w:val="clear" w:color="auto" w:fill="auto"/>
             <w:tcMar>
               <w:top w:w="100" w:type="dxa"/>
               <w:left w:w="100" w:type="dxa"/>
@@ -1559,7 +1498,7 @@
                 <w:right w:val="nil"/>
                 <w:between w:val="nil"/>
               </w:pBdr>
-              <w:spacing w:line="240" w:lineRule="auto"/>
+              <w:spacing w:after="0" w:line="240" w:lineRule="auto"/>
               <w:rPr>
                 <w:b/>
                 <w:bCs/>
@@ -1586,9 +1525,9 @@
           <w:noProof/>
         </w:rPr>
         <w:drawing>
-          <wp:inline distT="0" distB="0" distL="0" distR="0" wp14:anchorId="187C55E4" wp14:editId="067E3A1A">
-            <wp:extent cx="3668559" cy="4400550"/>
-            <wp:effectExtent l="0" t="0" r="1905" b="0"/>
+          <wp:inline distT="0" distB="0" distL="0" distR="0" wp14:anchorId="187C55E4" wp14:editId="2F1A9121">
+            <wp:extent cx="3669350" cy="4392883"/>
+            <wp:effectExtent l="0" t="0" r="1270" b="1905"/>
             <wp:docPr id="4" name="Picture 4"/>
             <wp:cNvGraphicFramePr>
               <a:graphicFrameLocks xmlns:a="http://schemas.openxmlformats.org/drawingml/2006/main" noChangeAspect="1"/>
@@ -1601,7 +1540,7 @@
                     <pic:cNvPicPr/>
                   </pic:nvPicPr>
                   <pic:blipFill>
-                    <a:blip r:embed="rId11">
+                    <a:blip r:embed="rId11" cstate="print">
                       <a:extLst>
                         <a:ext uri="{28A0092B-C50C-407E-A947-70E740481C1C}">
                           <a14:useLocalDpi xmlns:a14="http://schemas.microsoft.com/office/drawing/2010/main" val="0"/>
@@ -1615,7 +1554,7 @@
                   <pic:spPr>
                     <a:xfrm>
                       <a:off x="0" y="0"/>
-                      <a:ext cx="3669350" cy="4401499"/>
+                      <a:ext cx="3669350" cy="4392883"/>
                     </a:xfrm>
                     <a:prstGeom prst="rect">
                       <a:avLst/>
@@ -1631,7 +1570,6 @@
     <w:p/>
     <w:p>
       <w:pPr>
-        <w:jc w:val="both"/>
         <w:rPr>
           <w:sz w:val="32"/>
           <w:szCs w:val="32"/>
@@ -1644,7 +1582,23 @@
         <w:t>s</w:t>
       </w:r>
       <w:r>
-        <w:t xml:space="preserve"> the </w:t>
+        <w:t xml:space="preserve"> the</w:t>
+      </w:r>
+      <w:r>
+        <w:t xml:space="preserve"> </w:t>
+      </w:r>
+      <w:r>
+        <w:rPr>
+          <w:b/>
+          <w:bCs/>
+        </w:rPr>
+        <w:t>Dynamic Analysis</w:t>
+      </w:r>
+      <w:r>
+        <w:t xml:space="preserve"> tool on the</w:t>
+      </w:r>
+      <w:r>
+        <w:t xml:space="preserve"> </w:t>
       </w:r>
       <w:r>
         <w:rPr>
@@ -1756,7 +1710,6 @@
         <w:tc>
           <w:tcPr>
             <w:tcW w:w="1520" w:type="dxa"/>
-            <w:shd w:val="clear" w:color="auto" w:fill="auto"/>
             <w:tcMar>
               <w:top w:w="100" w:type="dxa"/>
               <w:left w:w="100" w:type="dxa"/>
@@ -1775,7 +1728,7 @@
                 <w:right w:val="nil"/>
                 <w:between w:val="nil"/>
               </w:pBdr>
-              <w:spacing w:line="240" w:lineRule="auto"/>
+              <w:spacing w:after="0" w:line="240" w:lineRule="auto"/>
               <w:jc w:val="right"/>
               <w:rPr>
                 <w:b/>
@@ -1794,7 +1747,6 @@
         <w:tc>
           <w:tcPr>
             <w:tcW w:w="2610" w:type="dxa"/>
-            <w:shd w:val="clear" w:color="auto" w:fill="auto"/>
             <w:tcMar>
               <w:top w:w="100" w:type="dxa"/>
               <w:left w:w="100" w:type="dxa"/>
@@ -1812,7 +1764,7 @@
                 <w:right w:val="nil"/>
                 <w:between w:val="nil"/>
               </w:pBdr>
-              <w:spacing w:line="240" w:lineRule="auto"/>
+              <w:spacing w:after="0" w:line="240" w:lineRule="auto"/>
             </w:pPr>
             <w:r>
               <w:t>Dynamic analysis output</w:t>
@@ -1824,7 +1776,6 @@
         <w:tc>
           <w:tcPr>
             <w:tcW w:w="1520" w:type="dxa"/>
-            <w:shd w:val="clear" w:color="auto" w:fill="auto"/>
             <w:tcMar>
               <w:top w:w="100" w:type="dxa"/>
               <w:left w:w="100" w:type="dxa"/>
@@ -1843,7 +1794,7 @@
                 <w:right w:val="nil"/>
                 <w:between w:val="nil"/>
               </w:pBdr>
-              <w:spacing w:line="240" w:lineRule="auto"/>
+              <w:spacing w:after="0" w:line="240" w:lineRule="auto"/>
               <w:jc w:val="right"/>
               <w:rPr>
                 <w:b/>
@@ -1862,7 +1813,6 @@
         <w:tc>
           <w:tcPr>
             <w:tcW w:w="2610" w:type="dxa"/>
-            <w:shd w:val="clear" w:color="auto" w:fill="auto"/>
             <w:tcMar>
               <w:top w:w="100" w:type="dxa"/>
               <w:left w:w="100" w:type="dxa"/>
@@ -1880,7 +1830,7 @@
                 <w:right w:val="nil"/>
                 <w:between w:val="nil"/>
               </w:pBdr>
-              <w:spacing w:line="240" w:lineRule="auto"/>
+              <w:spacing w:after="0" w:line="240" w:lineRule="auto"/>
             </w:pPr>
             <w:r>
               <w:t>Identified issues</w:t>
@@ -1896,7 +1846,7 @@
                 <w:right w:val="nil"/>
                 <w:between w:val="nil"/>
               </w:pBdr>
-              <w:spacing w:line="240" w:lineRule="auto"/>
+              <w:spacing w:after="0" w:line="240" w:lineRule="auto"/>
             </w:pPr>
             <w:r>
               <w:t>Dynamic analysis report</w:t>
@@ -1908,7 +1858,6 @@
         <w:tc>
           <w:tcPr>
             <w:tcW w:w="1520" w:type="dxa"/>
-            <w:shd w:val="clear" w:color="auto" w:fill="auto"/>
             <w:tcMar>
               <w:top w:w="100" w:type="dxa"/>
               <w:left w:w="100" w:type="dxa"/>
@@ -1927,7 +1876,7 @@
                 <w:right w:val="nil"/>
                 <w:between w:val="nil"/>
               </w:pBdr>
-              <w:spacing w:line="240" w:lineRule="auto"/>
+              <w:spacing w:after="0" w:line="240" w:lineRule="auto"/>
               <w:jc w:val="right"/>
               <w:rPr>
                 <w:b/>
@@ -1946,7 +1895,6 @@
         <w:tc>
           <w:tcPr>
             <w:tcW w:w="2610" w:type="dxa"/>
-            <w:shd w:val="clear" w:color="auto" w:fill="auto"/>
             <w:tcMar>
               <w:top w:w="100" w:type="dxa"/>
               <w:left w:w="100" w:type="dxa"/>
@@ -1964,7 +1912,7 @@
                 <w:right w:val="nil"/>
                 <w:between w:val="nil"/>
               </w:pBdr>
-              <w:spacing w:line="240" w:lineRule="auto"/>
+              <w:spacing w:after="0" w:line="240" w:lineRule="auto"/>
             </w:pPr>
             <w:r>
               <w:t>Security SME</w:t>
@@ -1980,7 +1928,7 @@
                 <w:right w:val="nil"/>
                 <w:between w:val="nil"/>
               </w:pBdr>
-              <w:spacing w:line="240" w:lineRule="auto"/>
+              <w:spacing w:after="0" w:line="240" w:lineRule="auto"/>
             </w:pPr>
             <w:r>
               <w:t>Development SME</w:t>
@@ -2043,12 +1991,28 @@
     </w:p>
     <w:p/>
     <w:p>
-      <w:pPr>
-        <w:spacing w:after="240"/>
-        <w:jc w:val="both"/>
-      </w:pPr>
-      <w:r>
-        <w:t xml:space="preserve">The Security SME and the Development SME review the </w:t>
+      <w:r>
+        <w:t xml:space="preserve">The </w:t>
+      </w:r>
+      <w:r>
+        <w:rPr>
+          <w:b/>
+          <w:bCs/>
+        </w:rPr>
+        <w:t>Security SME</w:t>
+      </w:r>
+      <w:r>
+        <w:t xml:space="preserve"> and the </w:t>
+      </w:r>
+      <w:r>
+        <w:rPr>
+          <w:b/>
+          <w:bCs/>
+        </w:rPr>
+        <w:t>Development SME</w:t>
+      </w:r>
+      <w:r>
+        <w:t xml:space="preserve"> review the </w:t>
       </w:r>
       <w:r>
         <w:rPr>
@@ -2177,9 +2141,6 @@
       </w:r>
     </w:p>
     <w:p>
-      <w:pPr>
-        <w:jc w:val="both"/>
-      </w:pPr>
       <w:r>
         <w:t xml:space="preserve">The </w:t>
       </w:r>
@@ -2215,7 +2176,22 @@
         <w:t>ssues</w:t>
       </w:r>
       <w:r>
-        <w:t xml:space="preserve"> artifact is a Static Analysis Results Interchange Format (</w:t>
+        <w:t xml:space="preserve"> artifact is </w:t>
+      </w:r>
+      <w:r>
+        <w:t>JSON</w:t>
+      </w:r>
+      <w:r>
+        <w:t>-</w:t>
+      </w:r>
+      <w:r>
+        <w:t>encoded</w:t>
+      </w:r>
+      <w:r>
+        <w:t xml:space="preserve"> </w:t>
+      </w:r>
+      <w:r>
+        <w:t>Static Analysis Results Interchange Format (</w:t>
       </w:r>
       <w:r>
         <w:rPr>
@@ -2226,9 +2202,6 @@
       </w:r>
       <w:r>
         <w:t>)</w:t>
-      </w:r>
-      <w:r>
-        <w:t xml:space="preserve"> encoded JSON</w:t>
       </w:r>
       <w:r>
         <w:t>.</w:t>
@@ -2280,10 +2253,6 @@
       </w:r>
     </w:p>
     <w:p>
-      <w:pPr>
-        <w:spacing w:after="240"/>
-        <w:jc w:val="both"/>
-      </w:pPr>
       <w:r>
         <w:t xml:space="preserve">The </w:t>
       </w:r>
@@ -2339,10 +2308,6 @@
       </w:r>
     </w:p>
     <w:p>
-      <w:pPr>
-        <w:spacing w:after="240"/>
-        <w:jc w:val="both"/>
-      </w:pPr>
       <w:r>
         <w:t xml:space="preserve">The report </w:t>
       </w:r>
@@ -2398,7 +2363,6 @@
           <w:ilvl w:val="0"/>
           <w:numId w:val="2"/>
         </w:numPr>
-        <w:spacing w:after="240"/>
         <w:ind w:left="360"/>
       </w:pPr>
       <w:r>
@@ -2406,9 +2370,6 @@
       </w:r>
     </w:p>
     <w:p>
-      <w:pPr>
-        <w:spacing w:after="240"/>
-      </w:pPr>
       <w:r>
         <w:t>The tool description includes:</w:t>
       </w:r>
@@ -2420,7 +2381,6 @@
           <w:ilvl w:val="0"/>
           <w:numId w:val="3"/>
         </w:numPr>
-        <w:spacing w:after="240"/>
         <w:ind w:left="360"/>
       </w:pPr>
       <w:r>
@@ -2434,7 +2394,6 @@
           <w:ilvl w:val="0"/>
           <w:numId w:val="3"/>
         </w:numPr>
-        <w:spacing w:after="240"/>
         <w:ind w:left="360"/>
       </w:pPr>
       <w:r>
@@ -2448,7 +2407,6 @@
           <w:ilvl w:val="0"/>
           <w:numId w:val="3"/>
         </w:numPr>
-        <w:spacing w:after="240"/>
         <w:ind w:left="360"/>
       </w:pPr>
       <w:r>
@@ -2462,7 +2420,6 @@
           <w:ilvl w:val="0"/>
           <w:numId w:val="3"/>
         </w:numPr>
-        <w:spacing w:after="240"/>
         <w:ind w:left="360"/>
       </w:pPr>
       <w:r>
@@ -2476,7 +2433,6 @@
           <w:ilvl w:val="0"/>
           <w:numId w:val="3"/>
         </w:numPr>
-        <w:spacing w:after="240"/>
         <w:ind w:left="360"/>
       </w:pPr>
       <w:r>
@@ -2505,9 +2461,6 @@
       </w:r>
     </w:p>
     <w:p>
-      <w:pPr>
-        <w:spacing w:after="240"/>
-      </w:pPr>
       <w:r>
         <w:t>The tool rules (one or more) convey the classes of analysis performed (software crash, time out, memory limits). Each includes:</w:t>
       </w:r>
@@ -2519,7 +2472,6 @@
           <w:ilvl w:val="0"/>
           <w:numId w:val="4"/>
         </w:numPr>
-        <w:spacing w:after="240"/>
         <w:ind w:left="360"/>
       </w:pPr>
       <w:r>
@@ -2533,7 +2485,6 @@
           <w:ilvl w:val="0"/>
           <w:numId w:val="4"/>
         </w:numPr>
-        <w:spacing w:after="240"/>
         <w:ind w:left="360"/>
       </w:pPr>
       <w:r>
@@ -2547,7 +2498,6 @@
           <w:ilvl w:val="0"/>
           <w:numId w:val="4"/>
         </w:numPr>
-        <w:spacing w:after="240"/>
         <w:ind w:left="360"/>
       </w:pPr>
       <w:r>
@@ -2561,7 +2511,6 @@
           <w:ilvl w:val="0"/>
           <w:numId w:val="4"/>
         </w:numPr>
-        <w:spacing w:after="240"/>
         <w:ind w:left="360"/>
       </w:pPr>
       <w:r>
@@ -2575,7 +2524,6 @@
           <w:ilvl w:val="0"/>
           <w:numId w:val="4"/>
         </w:numPr>
-        <w:spacing w:after="240"/>
         <w:ind w:left="360"/>
       </w:pPr>
       <w:r>
@@ -2583,9 +2531,6 @@
       </w:r>
     </w:p>
     <w:p>
-      <w:pPr>
-        <w:spacing w:after="240"/>
-      </w:pPr>
       <w:r>
         <w:t>The instrumented element description (one or more) provides information related to the element under consideration. Each includes:</w:t>
       </w:r>
@@ -2597,7 +2542,6 @@
           <w:ilvl w:val="0"/>
           <w:numId w:val="5"/>
         </w:numPr>
-        <w:spacing w:after="240"/>
         <w:ind w:left="360"/>
       </w:pPr>
       <w:r>
@@ -2611,7 +2555,6 @@
           <w:ilvl w:val="0"/>
           <w:numId w:val="5"/>
         </w:numPr>
-        <w:spacing w:after="240"/>
         <w:ind w:left="360"/>
       </w:pPr>
       <w:r>
@@ -2625,7 +2568,6 @@
           <w:ilvl w:val="0"/>
           <w:numId w:val="5"/>
         </w:numPr>
-        <w:spacing w:after="240"/>
         <w:ind w:left="360"/>
       </w:pPr>
       <w:r>
@@ -2633,9 +2575,6 @@
       </w:r>
     </w:p>
     <w:p>
-      <w:pPr>
-        <w:spacing w:after="240"/>
-      </w:pPr>
       <w:r>
         <w:t>The element properties further describe the element. Each includes:</w:t>
       </w:r>
@@ -2647,7 +2586,6 @@
           <w:ilvl w:val="0"/>
           <w:numId w:val="6"/>
         </w:numPr>
-        <w:spacing w:after="240"/>
         <w:ind w:left="360"/>
       </w:pPr>
       <w:r>
@@ -2702,7 +2640,6 @@
           <w:ilvl w:val="0"/>
           <w:numId w:val="6"/>
         </w:numPr>
-        <w:spacing w:after="240"/>
         <w:ind w:left="360"/>
       </w:pPr>
       <w:r>
@@ -2722,7 +2659,6 @@
           <w:ilvl w:val="0"/>
           <w:numId w:val="6"/>
         </w:numPr>
-        <w:spacing w:after="240"/>
         <w:ind w:left="360"/>
       </w:pPr>
       <w:r>
@@ -2736,7 +2672,6 @@
           <w:ilvl w:val="0"/>
           <w:numId w:val="6"/>
         </w:numPr>
-        <w:spacing w:after="240"/>
         <w:ind w:left="360"/>
       </w:pPr>
       <w:r>
@@ -2749,9 +2684,6 @@
       </w:r>
     </w:p>
     <w:p>
-      <w:pPr>
-        <w:spacing w:after="240"/>
-      </w:pPr>
       <w:r>
         <w:lastRenderedPageBreak/>
         <w:t>The analysis results (one or more) describe the issues exposed by the analysis. Each includes:</w:t>
@@ -2764,7 +2696,6 @@
           <w:ilvl w:val="0"/>
           <w:numId w:val="7"/>
         </w:numPr>
-        <w:spacing w:after="240"/>
         <w:ind w:left="360"/>
       </w:pPr>
       <w:r>
@@ -2778,7 +2709,6 @@
           <w:ilvl w:val="0"/>
           <w:numId w:val="7"/>
         </w:numPr>
-        <w:spacing w:after="240"/>
         <w:ind w:left="360"/>
       </w:pPr>
       <w:r>
@@ -2792,7 +2722,6 @@
           <w:ilvl w:val="0"/>
           <w:numId w:val="7"/>
         </w:numPr>
-        <w:spacing w:after="240"/>
         <w:ind w:left="360"/>
       </w:pPr>
       <w:r>
@@ -2831,6 +2760,7 @@
           <w:numId w:val="1"/>
         </w:numPr>
         <w:ind w:left="360"/>
+        <w:jc w:val="left"/>
         <w:rPr>
           <w:color w:val="000000" w:themeColor="text1"/>
         </w:rPr>
@@ -3058,7 +2988,7 @@
 </file>
 
 <file path=word/endnotes.xml><?xml version="1.0" encoding="utf-8"?>
-<w:endnotes xmlns:wpc="http://schemas.microsoft.com/office/word/2010/wordprocessingCanvas" xmlns:cx="http://schemas.microsoft.com/office/drawing/2014/chartex" xmlns:cx1="http://schemas.microsoft.com/office/drawing/2015/9/8/chartex" xmlns:cx2="http://schemas.microsoft.com/office/drawing/2015/10/21/chartex" xmlns:cx3="http://schemas.microsoft.com/office/drawing/2016/5/9/chartex" xmlns:cx4="http://schemas.microsoft.com/office/drawing/2016/5/10/chartex" xmlns:cx5="http://schemas.microsoft.com/office/drawing/2016/5/11/chartex" xmlns:cx6="http://schemas.microsoft.com/office/drawing/2016/5/12/chartex" xmlns:cx7="http://schemas.microsoft.com/office/drawing/2016/5/13/chartex" xmlns:cx8="http://schemas.microsoft.com/office/drawing/2016/5/14/chartex" xmlns:mc="http://schemas.openxmlformats.org/markup-compatibility/2006" xmlns:aink="http://schemas.microsoft.com/office/drawing/2016/ink" xmlns:am3d="http://schemas.microsoft.com/office/drawing/2017/model3d" xmlns:o="urn:schemas-microsoft-com:office:office" xmlns:oel="http://schemas.microsoft.com/office/2019/extlst" xmlns:r="http://schemas.openxmlformats.org/officeDocument/2006/relationships" xmlns:m="http://schemas.openxmlformats.org/officeDocument/2006/math" xmlns:v="urn:schemas-microsoft-com:vml" xmlns:wp14="http://schemas.microsoft.com/office/word/2010/wordprocessingDrawing" xmlns:wp="http://schemas.openxmlformats.org/drawingml/2006/wordprocessingDrawing" xmlns:w10="urn:schemas-microsoft-com:office:word" xmlns:w="http://schemas.openxmlformats.org/wordprocessingml/2006/main" xmlns:w14="http://schemas.microsoft.com/office/word/2010/wordml" xmlns:w15="http://schemas.microsoft.com/office/word/2012/wordml" xmlns:w16cex="http://schemas.microsoft.com/office/word/2018/wordml/cex" xmlns:w16cid="http://schemas.microsoft.com/office/word/2016/wordml/cid" xmlns:w16="http://schemas.microsoft.com/office/word/2018/wordml" xmlns:w16sdtdh="http://schemas.microsoft.com/office/word/2020/wordml/sdtdatahash" xmlns:w16se="http://schemas.microsoft.com/office/word/2015/wordml/symex" xmlns:wpg="http://schemas.microsoft.com/office/word/2010/wordprocessingGroup" xmlns:wpi="http://schemas.microsoft.com/office/word/2010/wordprocessingInk" xmlns:wne="http://schemas.microsoft.com/office/word/2006/wordml" xmlns:wps="http://schemas.microsoft.com/office/word/2010/wordprocessingShape" mc:Ignorable="w14 w15 w16se w16cid w16 w16cex w16sdtdh wp14">
+<w:endnotes xmlns:wpc="http://schemas.microsoft.com/office/word/2010/wordprocessingCanvas" xmlns:cx="http://schemas.microsoft.com/office/drawing/2014/chartex" xmlns:cx1="http://schemas.microsoft.com/office/drawing/2015/9/8/chartex" xmlns:cx2="http://schemas.microsoft.com/office/drawing/2015/10/21/chartex" xmlns:cx3="http://schemas.microsoft.com/office/drawing/2016/5/9/chartex" xmlns:cx4="http://schemas.microsoft.com/office/drawing/2016/5/10/chartex" xmlns:cx5="http://schemas.microsoft.com/office/drawing/2016/5/11/chartex" xmlns:cx6="http://schemas.microsoft.com/office/drawing/2016/5/12/chartex" xmlns:cx7="http://schemas.microsoft.com/office/drawing/2016/5/13/chartex" xmlns:cx8="http://schemas.microsoft.com/office/drawing/2016/5/14/chartex" xmlns:mc="http://schemas.openxmlformats.org/markup-compatibility/2006" xmlns:aink="http://schemas.microsoft.com/office/drawing/2016/ink" xmlns:am3d="http://schemas.microsoft.com/office/drawing/2017/model3d" xmlns:o="urn:schemas-microsoft-com:office:office" xmlns:oel="http://schemas.microsoft.com/office/2019/extlst" xmlns:r="http://schemas.openxmlformats.org/officeDocument/2006/relationships" xmlns:m="http://schemas.openxmlformats.org/officeDocument/2006/math" xmlns:v="urn:schemas-microsoft-com:vml" xmlns:wp14="http://schemas.microsoft.com/office/word/2010/wordprocessingDrawing" xmlns:wp="http://schemas.openxmlformats.org/drawingml/2006/wordprocessingDrawing" xmlns:w10="urn:schemas-microsoft-com:office:word" xmlns:w="http://schemas.openxmlformats.org/wordprocessingml/2006/main" xmlns:w14="http://schemas.microsoft.com/office/word/2010/wordml" xmlns:w15="http://schemas.microsoft.com/office/word/2012/wordml" xmlns:w16cex="http://schemas.microsoft.com/office/word/2018/wordml/cex" xmlns:w16cid="http://schemas.microsoft.com/office/word/2016/wordml/cid" xmlns:w16="http://schemas.microsoft.com/office/word/2018/wordml" xmlns:w16du="http://schemas.microsoft.com/office/word/2023/wordml/word16du" xmlns:w16sdtdh="http://schemas.microsoft.com/office/word/2020/wordml/sdtdatahash" xmlns:w16sdtfl="http://schemas.microsoft.com/office/word/2024/wordml/sdtformatlock" xmlns:w16se="http://schemas.microsoft.com/office/word/2015/wordml/symex" xmlns:wpg="http://schemas.microsoft.com/office/word/2010/wordprocessingGroup" xmlns:wpi="http://schemas.microsoft.com/office/word/2010/wordprocessingInk" xmlns:wne="http://schemas.microsoft.com/office/word/2006/wordml" xmlns:wps="http://schemas.microsoft.com/office/word/2010/wordprocessingShape" mc:Ignorable="w14 w15 w16se w16cid w16 w16cex w16sdtdh w16sdtfl w16du wp14">
   <w:endnote w:type="separator" w:id="-1">
     <w:p>
       <w:pPr>
@@ -3083,7 +3013,7 @@
 </file>
 
 <file path=word/footer1.xml><?xml version="1.0" encoding="utf-8"?>
-<w:ftr xmlns:wpc="http://schemas.microsoft.com/office/word/2010/wordprocessingCanvas" xmlns:cx="http://schemas.microsoft.com/office/drawing/2014/chartex" xmlns:cx1="http://schemas.microsoft.com/office/drawing/2015/9/8/chartex" xmlns:cx2="http://schemas.microsoft.com/office/drawing/2015/10/21/chartex" xmlns:cx3="http://schemas.microsoft.com/office/drawing/2016/5/9/chartex" xmlns:cx4="http://schemas.microsoft.com/office/drawing/2016/5/10/chartex" xmlns:cx5="http://schemas.microsoft.com/office/drawing/2016/5/11/chartex" xmlns:cx6="http://schemas.microsoft.com/office/drawing/2016/5/12/chartex" xmlns:cx7="http://schemas.microsoft.com/office/drawing/2016/5/13/chartex" xmlns:cx8="http://schemas.microsoft.com/office/drawing/2016/5/14/chartex" xmlns:mc="http://schemas.openxmlformats.org/markup-compatibility/2006" xmlns:aink="http://schemas.microsoft.com/office/drawing/2016/ink" xmlns:am3d="http://schemas.microsoft.com/office/drawing/2017/model3d" xmlns:o="urn:schemas-microsoft-com:office:office" xmlns:oel="http://schemas.microsoft.com/office/2019/extlst" xmlns:r="http://schemas.openxmlformats.org/officeDocument/2006/relationships" xmlns:m="http://schemas.openxmlformats.org/officeDocument/2006/math" xmlns:v="urn:schemas-microsoft-com:vml" xmlns:wp14="http://schemas.microsoft.com/office/word/2010/wordprocessingDrawing" xmlns:wp="http://schemas.openxmlformats.org/drawingml/2006/wordprocessingDrawing" xmlns:w10="urn:schemas-microsoft-com:office:word" xmlns:w="http://schemas.openxmlformats.org/wordprocessingml/2006/main" xmlns:w14="http://schemas.microsoft.com/office/word/2010/wordml" xmlns:w15="http://schemas.microsoft.com/office/word/2012/wordml" xmlns:w16cex="http://schemas.microsoft.com/office/word/2018/wordml/cex" xmlns:w16cid="http://schemas.microsoft.com/office/word/2016/wordml/cid" xmlns:w16="http://schemas.microsoft.com/office/word/2018/wordml" xmlns:w16sdtdh="http://schemas.microsoft.com/office/word/2020/wordml/sdtdatahash" xmlns:w16se="http://schemas.microsoft.com/office/word/2015/wordml/symex" xmlns:wpg="http://schemas.microsoft.com/office/word/2010/wordprocessingGroup" xmlns:wpi="http://schemas.microsoft.com/office/word/2010/wordprocessingInk" xmlns:wne="http://schemas.microsoft.com/office/word/2006/wordml" xmlns:wps="http://schemas.microsoft.com/office/word/2010/wordprocessingShape" mc:Ignorable="w14 w15 w16se w16cid w16 w16cex w16sdtdh wp14">
+<w:ftr xmlns:wpc="http://schemas.microsoft.com/office/word/2010/wordprocessingCanvas" xmlns:cx="http://schemas.microsoft.com/office/drawing/2014/chartex" xmlns:cx1="http://schemas.microsoft.com/office/drawing/2015/9/8/chartex" xmlns:cx2="http://schemas.microsoft.com/office/drawing/2015/10/21/chartex" xmlns:cx3="http://schemas.microsoft.com/office/drawing/2016/5/9/chartex" xmlns:cx4="http://schemas.microsoft.com/office/drawing/2016/5/10/chartex" xmlns:cx5="http://schemas.microsoft.com/office/drawing/2016/5/11/chartex" xmlns:cx6="http://schemas.microsoft.com/office/drawing/2016/5/12/chartex" xmlns:cx7="http://schemas.microsoft.com/office/drawing/2016/5/13/chartex" xmlns:cx8="http://schemas.microsoft.com/office/drawing/2016/5/14/chartex" xmlns:mc="http://schemas.openxmlformats.org/markup-compatibility/2006" xmlns:aink="http://schemas.microsoft.com/office/drawing/2016/ink" xmlns:am3d="http://schemas.microsoft.com/office/drawing/2017/model3d" xmlns:o="urn:schemas-microsoft-com:office:office" xmlns:oel="http://schemas.microsoft.com/office/2019/extlst" xmlns:r="http://schemas.openxmlformats.org/officeDocument/2006/relationships" xmlns:m="http://schemas.openxmlformats.org/officeDocument/2006/math" xmlns:v="urn:schemas-microsoft-com:vml" xmlns:wp14="http://schemas.microsoft.com/office/word/2010/wordprocessingDrawing" xmlns:wp="http://schemas.openxmlformats.org/drawingml/2006/wordprocessingDrawing" xmlns:w10="urn:schemas-microsoft-com:office:word" xmlns:w="http://schemas.openxmlformats.org/wordprocessingml/2006/main" xmlns:w14="http://schemas.microsoft.com/office/word/2010/wordml" xmlns:w15="http://schemas.microsoft.com/office/word/2012/wordml" xmlns:w16cex="http://schemas.microsoft.com/office/word/2018/wordml/cex" xmlns:w16cid="http://schemas.microsoft.com/office/word/2016/wordml/cid" xmlns:w16="http://schemas.microsoft.com/office/word/2018/wordml" xmlns:w16du="http://schemas.microsoft.com/office/word/2023/wordml/word16du" xmlns:w16sdtdh="http://schemas.microsoft.com/office/word/2020/wordml/sdtdatahash" xmlns:w16sdtfl="http://schemas.microsoft.com/office/word/2024/wordml/sdtformatlock" xmlns:w16se="http://schemas.microsoft.com/office/word/2015/wordml/symex" xmlns:wpg="http://schemas.microsoft.com/office/word/2010/wordprocessingGroup" xmlns:wpi="http://schemas.microsoft.com/office/word/2010/wordprocessingInk" xmlns:wne="http://schemas.microsoft.com/office/word/2006/wordml" xmlns:wps="http://schemas.microsoft.com/office/word/2010/wordprocessingShape" mc:Ignorable="w14 w15 w16se w16cid w16 w16cex w16sdtdh w16sdtfl w16du wp14">
   <w:sdt>
     <w:sdtPr>
       <w:rPr>
@@ -3135,7 +3065,7 @@
 </file>
 
 <file path=word/footer2.xml><?xml version="1.0" encoding="utf-8"?>
-<w:ftr xmlns:wpc="http://schemas.microsoft.com/office/word/2010/wordprocessingCanvas" xmlns:cx="http://schemas.microsoft.com/office/drawing/2014/chartex" xmlns:cx1="http://schemas.microsoft.com/office/drawing/2015/9/8/chartex" xmlns:cx2="http://schemas.microsoft.com/office/drawing/2015/10/21/chartex" xmlns:cx3="http://schemas.microsoft.com/office/drawing/2016/5/9/chartex" xmlns:cx4="http://schemas.microsoft.com/office/drawing/2016/5/10/chartex" xmlns:cx5="http://schemas.microsoft.com/office/drawing/2016/5/11/chartex" xmlns:cx6="http://schemas.microsoft.com/office/drawing/2016/5/12/chartex" xmlns:cx7="http://schemas.microsoft.com/office/drawing/2016/5/13/chartex" xmlns:cx8="http://schemas.microsoft.com/office/drawing/2016/5/14/chartex" xmlns:mc="http://schemas.openxmlformats.org/markup-compatibility/2006" xmlns:aink="http://schemas.microsoft.com/office/drawing/2016/ink" xmlns:am3d="http://schemas.microsoft.com/office/drawing/2017/model3d" xmlns:o="urn:schemas-microsoft-com:office:office" xmlns:oel="http://schemas.microsoft.com/office/2019/extlst" xmlns:r="http://schemas.openxmlformats.org/officeDocument/2006/relationships" xmlns:m="http://schemas.openxmlformats.org/officeDocument/2006/math" xmlns:v="urn:schemas-microsoft-com:vml" xmlns:wp14="http://schemas.microsoft.com/office/word/2010/wordprocessingDrawing" xmlns:wp="http://schemas.openxmlformats.org/drawingml/2006/wordprocessingDrawing" xmlns:w10="urn:schemas-microsoft-com:office:word" xmlns:w="http://schemas.openxmlformats.org/wordprocessingml/2006/main" xmlns:w14="http://schemas.microsoft.com/office/word/2010/wordml" xmlns:w15="http://schemas.microsoft.com/office/word/2012/wordml" xmlns:w16cex="http://schemas.microsoft.com/office/word/2018/wordml/cex" xmlns:w16cid="http://schemas.microsoft.com/office/word/2016/wordml/cid" xmlns:w16="http://schemas.microsoft.com/office/word/2018/wordml" xmlns:w16sdtdh="http://schemas.microsoft.com/office/word/2020/wordml/sdtdatahash" xmlns:w16se="http://schemas.microsoft.com/office/word/2015/wordml/symex" xmlns:wpg="http://schemas.microsoft.com/office/word/2010/wordprocessingGroup" xmlns:wpi="http://schemas.microsoft.com/office/word/2010/wordprocessingInk" xmlns:wne="http://schemas.microsoft.com/office/word/2006/wordml" xmlns:wps="http://schemas.microsoft.com/office/word/2010/wordprocessingShape" mc:Ignorable="w14 w15 w16se w16cid w16 w16cex w16sdtdh wp14">
+<w:ftr xmlns:wpc="http://schemas.microsoft.com/office/word/2010/wordprocessingCanvas" xmlns:cx="http://schemas.microsoft.com/office/drawing/2014/chartex" xmlns:cx1="http://schemas.microsoft.com/office/drawing/2015/9/8/chartex" xmlns:cx2="http://schemas.microsoft.com/office/drawing/2015/10/21/chartex" xmlns:cx3="http://schemas.microsoft.com/office/drawing/2016/5/9/chartex" xmlns:cx4="http://schemas.microsoft.com/office/drawing/2016/5/10/chartex" xmlns:cx5="http://schemas.microsoft.com/office/drawing/2016/5/11/chartex" xmlns:cx6="http://schemas.microsoft.com/office/drawing/2016/5/12/chartex" xmlns:cx7="http://schemas.microsoft.com/office/drawing/2016/5/13/chartex" xmlns:cx8="http://schemas.microsoft.com/office/drawing/2016/5/14/chartex" xmlns:mc="http://schemas.openxmlformats.org/markup-compatibility/2006" xmlns:aink="http://schemas.microsoft.com/office/drawing/2016/ink" xmlns:am3d="http://schemas.microsoft.com/office/drawing/2017/model3d" xmlns:o="urn:schemas-microsoft-com:office:office" xmlns:oel="http://schemas.microsoft.com/office/2019/extlst" xmlns:r="http://schemas.openxmlformats.org/officeDocument/2006/relationships" xmlns:m="http://schemas.openxmlformats.org/officeDocument/2006/math" xmlns:v="urn:schemas-microsoft-com:vml" xmlns:wp14="http://schemas.microsoft.com/office/word/2010/wordprocessingDrawing" xmlns:wp="http://schemas.openxmlformats.org/drawingml/2006/wordprocessingDrawing" xmlns:w10="urn:schemas-microsoft-com:office:word" xmlns:w="http://schemas.openxmlformats.org/wordprocessingml/2006/main" xmlns:w14="http://schemas.microsoft.com/office/word/2010/wordml" xmlns:w15="http://schemas.microsoft.com/office/word/2012/wordml" xmlns:w16cex="http://schemas.microsoft.com/office/word/2018/wordml/cex" xmlns:w16cid="http://schemas.microsoft.com/office/word/2016/wordml/cid" xmlns:w16="http://schemas.microsoft.com/office/word/2018/wordml" xmlns:w16du="http://schemas.microsoft.com/office/word/2023/wordml/word16du" xmlns:w16sdtdh="http://schemas.microsoft.com/office/word/2020/wordml/sdtdatahash" xmlns:w16sdtfl="http://schemas.microsoft.com/office/word/2024/wordml/sdtformatlock" xmlns:w16se="http://schemas.microsoft.com/office/word/2015/wordml/symex" xmlns:wpg="http://schemas.microsoft.com/office/word/2010/wordprocessingGroup" xmlns:wpi="http://schemas.microsoft.com/office/word/2010/wordprocessingInk" xmlns:wne="http://schemas.microsoft.com/office/word/2006/wordml" xmlns:wps="http://schemas.microsoft.com/office/word/2010/wordprocessingShape" mc:Ignorable="w14 w15 w16se w16cid w16 w16cex w16sdtdh w16sdtfl w16du wp14">
   <w:sdt>
     <w:sdtPr>
       <w:rPr>
@@ -3200,7 +3130,7 @@
 </file>
 
 <file path=word/footnotes.xml><?xml version="1.0" encoding="utf-8"?>
-<w:footnotes xmlns:wpc="http://schemas.microsoft.com/office/word/2010/wordprocessingCanvas" xmlns:cx="http://schemas.microsoft.com/office/drawing/2014/chartex" xmlns:cx1="http://schemas.microsoft.com/office/drawing/2015/9/8/chartex" xmlns:cx2="http://schemas.microsoft.com/office/drawing/2015/10/21/chartex" xmlns:cx3="http://schemas.microsoft.com/office/drawing/2016/5/9/chartex" xmlns:cx4="http://schemas.microsoft.com/office/drawing/2016/5/10/chartex" xmlns:cx5="http://schemas.microsoft.com/office/drawing/2016/5/11/chartex" xmlns:cx6="http://schemas.microsoft.com/office/drawing/2016/5/12/chartex" xmlns:cx7="http://schemas.microsoft.com/office/drawing/2016/5/13/chartex" xmlns:cx8="http://schemas.microsoft.com/office/drawing/2016/5/14/chartex" xmlns:mc="http://schemas.openxmlformats.org/markup-compatibility/2006" xmlns:aink="http://schemas.microsoft.com/office/drawing/2016/ink" xmlns:am3d="http://schemas.microsoft.com/office/drawing/2017/model3d" xmlns:o="urn:schemas-microsoft-com:office:office" xmlns:oel="http://schemas.microsoft.com/office/2019/extlst" xmlns:r="http://schemas.openxmlformats.org/officeDocument/2006/relationships" xmlns:m="http://schemas.openxmlformats.org/officeDocument/2006/math" xmlns:v="urn:schemas-microsoft-com:vml" xmlns:wp14="http://schemas.microsoft.com/office/word/2010/wordprocessingDrawing" xmlns:wp="http://schemas.openxmlformats.org/drawingml/2006/wordprocessingDrawing" xmlns:w10="urn:schemas-microsoft-com:office:word" xmlns:w="http://schemas.openxmlformats.org/wordprocessingml/2006/main" xmlns:w14="http://schemas.microsoft.com/office/word/2010/wordml" xmlns:w15="http://schemas.microsoft.com/office/word/2012/wordml" xmlns:w16cex="http://schemas.microsoft.com/office/word/2018/wordml/cex" xmlns:w16cid="http://schemas.microsoft.com/office/word/2016/wordml/cid" xmlns:w16="http://schemas.microsoft.com/office/word/2018/wordml" xmlns:w16sdtdh="http://schemas.microsoft.com/office/word/2020/wordml/sdtdatahash" xmlns:w16se="http://schemas.microsoft.com/office/word/2015/wordml/symex" xmlns:wpg="http://schemas.microsoft.com/office/word/2010/wordprocessingGroup" xmlns:wpi="http://schemas.microsoft.com/office/word/2010/wordprocessingInk" xmlns:wne="http://schemas.microsoft.com/office/word/2006/wordml" xmlns:wps="http://schemas.microsoft.com/office/word/2010/wordprocessingShape" mc:Ignorable="w14 w15 w16se w16cid w16 w16cex w16sdtdh wp14">
+<w:footnotes xmlns:wpc="http://schemas.microsoft.com/office/word/2010/wordprocessingCanvas" xmlns:cx="http://schemas.microsoft.com/office/drawing/2014/chartex" xmlns:cx1="http://schemas.microsoft.com/office/drawing/2015/9/8/chartex" xmlns:cx2="http://schemas.microsoft.com/office/drawing/2015/10/21/chartex" xmlns:cx3="http://schemas.microsoft.com/office/drawing/2016/5/9/chartex" xmlns:cx4="http://schemas.microsoft.com/office/drawing/2016/5/10/chartex" xmlns:cx5="http://schemas.microsoft.com/office/drawing/2016/5/11/chartex" xmlns:cx6="http://schemas.microsoft.com/office/drawing/2016/5/12/chartex" xmlns:cx7="http://schemas.microsoft.com/office/drawing/2016/5/13/chartex" xmlns:cx8="http://schemas.microsoft.com/office/drawing/2016/5/14/chartex" xmlns:mc="http://schemas.openxmlformats.org/markup-compatibility/2006" xmlns:aink="http://schemas.microsoft.com/office/drawing/2016/ink" xmlns:am3d="http://schemas.microsoft.com/office/drawing/2017/model3d" xmlns:o="urn:schemas-microsoft-com:office:office" xmlns:oel="http://schemas.microsoft.com/office/2019/extlst" xmlns:r="http://schemas.openxmlformats.org/officeDocument/2006/relationships" xmlns:m="http://schemas.openxmlformats.org/officeDocument/2006/math" xmlns:v="urn:schemas-microsoft-com:vml" xmlns:wp14="http://schemas.microsoft.com/office/word/2010/wordprocessingDrawing" xmlns:wp="http://schemas.openxmlformats.org/drawingml/2006/wordprocessingDrawing" xmlns:w10="urn:schemas-microsoft-com:office:word" xmlns:w="http://schemas.openxmlformats.org/wordprocessingml/2006/main" xmlns:w14="http://schemas.microsoft.com/office/word/2010/wordml" xmlns:w15="http://schemas.microsoft.com/office/word/2012/wordml" xmlns:w16cex="http://schemas.microsoft.com/office/word/2018/wordml/cex" xmlns:w16cid="http://schemas.microsoft.com/office/word/2016/wordml/cid" xmlns:w16="http://schemas.microsoft.com/office/word/2018/wordml" xmlns:w16du="http://schemas.microsoft.com/office/word/2023/wordml/word16du" xmlns:w16sdtdh="http://schemas.microsoft.com/office/word/2020/wordml/sdtdatahash" xmlns:w16sdtfl="http://schemas.microsoft.com/office/word/2024/wordml/sdtformatlock" xmlns:w16se="http://schemas.microsoft.com/office/word/2015/wordml/symex" xmlns:wpg="http://schemas.microsoft.com/office/word/2010/wordprocessingGroup" xmlns:wpi="http://schemas.microsoft.com/office/word/2010/wordprocessingInk" xmlns:wne="http://schemas.microsoft.com/office/word/2006/wordml" xmlns:wps="http://schemas.microsoft.com/office/word/2010/wordprocessingShape" mc:Ignorable="w14 w15 w16se w16cid w16 w16cex w16sdtdh w16sdtfl w16du wp14">
   <w:footnote w:type="separator" w:id="-1">
     <w:p>
       <w:pPr>
@@ -3225,7 +3155,7 @@
 </file>
 
 <file path=word/header1.xml><?xml version="1.0" encoding="utf-8"?>
-<w:hdr xmlns:wpc="http://schemas.microsoft.com/office/word/2010/wordprocessingCanvas" xmlns:cx="http://schemas.microsoft.com/office/drawing/2014/chartex" xmlns:cx1="http://schemas.microsoft.com/office/drawing/2015/9/8/chartex" xmlns:cx2="http://schemas.microsoft.com/office/drawing/2015/10/21/chartex" xmlns:cx3="http://schemas.microsoft.com/office/drawing/2016/5/9/chartex" xmlns:cx4="http://schemas.microsoft.com/office/drawing/2016/5/10/chartex" xmlns:cx5="http://schemas.microsoft.com/office/drawing/2016/5/11/chartex" xmlns:cx6="http://schemas.microsoft.com/office/drawing/2016/5/12/chartex" xmlns:cx7="http://schemas.microsoft.com/office/drawing/2016/5/13/chartex" xmlns:cx8="http://schemas.microsoft.com/office/drawing/2016/5/14/chartex" xmlns:mc="http://schemas.openxmlformats.org/markup-compatibility/2006" xmlns:aink="http://schemas.microsoft.com/office/drawing/2016/ink" xmlns:am3d="http://schemas.microsoft.com/office/drawing/2017/model3d" xmlns:o="urn:schemas-microsoft-com:office:office" xmlns:oel="http://schemas.microsoft.com/office/2019/extlst" xmlns:r="http://schemas.openxmlformats.org/officeDocument/2006/relationships" xmlns:m="http://schemas.openxmlformats.org/officeDocument/2006/math" xmlns:v="urn:schemas-microsoft-com:vml" xmlns:wp14="http://schemas.microsoft.com/office/word/2010/wordprocessingDrawing" xmlns:wp="http://schemas.openxmlformats.org/drawingml/2006/wordprocessingDrawing" xmlns:w10="urn:schemas-microsoft-com:office:word" xmlns:w="http://schemas.openxmlformats.org/wordprocessingml/2006/main" xmlns:w14="http://schemas.microsoft.com/office/word/2010/wordml" xmlns:w15="http://schemas.microsoft.com/office/word/2012/wordml" xmlns:w16cex="http://schemas.microsoft.com/office/word/2018/wordml/cex" xmlns:w16cid="http://schemas.microsoft.com/office/word/2016/wordml/cid" xmlns:w16="http://schemas.microsoft.com/office/word/2018/wordml" xmlns:w16sdtdh="http://schemas.microsoft.com/office/word/2020/wordml/sdtdatahash" xmlns:w16se="http://schemas.microsoft.com/office/word/2015/wordml/symex" xmlns:wpg="http://schemas.microsoft.com/office/word/2010/wordprocessingGroup" xmlns:wpi="http://schemas.microsoft.com/office/word/2010/wordprocessingInk" xmlns:wne="http://schemas.microsoft.com/office/word/2006/wordml" xmlns:wps="http://schemas.microsoft.com/office/word/2010/wordprocessingShape" mc:Ignorable="w14 w15 w16se w16cid w16 w16cex w16sdtdh wp14">
+<w:hdr xmlns:wpc="http://schemas.microsoft.com/office/word/2010/wordprocessingCanvas" xmlns:cx="http://schemas.microsoft.com/office/drawing/2014/chartex" xmlns:cx1="http://schemas.microsoft.com/office/drawing/2015/9/8/chartex" xmlns:cx2="http://schemas.microsoft.com/office/drawing/2015/10/21/chartex" xmlns:cx3="http://schemas.microsoft.com/office/drawing/2016/5/9/chartex" xmlns:cx4="http://schemas.microsoft.com/office/drawing/2016/5/10/chartex" xmlns:cx5="http://schemas.microsoft.com/office/drawing/2016/5/11/chartex" xmlns:cx6="http://schemas.microsoft.com/office/drawing/2016/5/12/chartex" xmlns:cx7="http://schemas.microsoft.com/office/drawing/2016/5/13/chartex" xmlns:cx8="http://schemas.microsoft.com/office/drawing/2016/5/14/chartex" xmlns:mc="http://schemas.openxmlformats.org/markup-compatibility/2006" xmlns:aink="http://schemas.microsoft.com/office/drawing/2016/ink" xmlns:am3d="http://schemas.microsoft.com/office/drawing/2017/model3d" xmlns:o="urn:schemas-microsoft-com:office:office" xmlns:oel="http://schemas.microsoft.com/office/2019/extlst" xmlns:r="http://schemas.openxmlformats.org/officeDocument/2006/relationships" xmlns:m="http://schemas.openxmlformats.org/officeDocument/2006/math" xmlns:v="urn:schemas-microsoft-com:vml" xmlns:wp14="http://schemas.microsoft.com/office/word/2010/wordprocessingDrawing" xmlns:wp="http://schemas.openxmlformats.org/drawingml/2006/wordprocessingDrawing" xmlns:w10="urn:schemas-microsoft-com:office:word" xmlns:w="http://schemas.openxmlformats.org/wordprocessingml/2006/main" xmlns:w14="http://schemas.microsoft.com/office/word/2010/wordml" xmlns:w15="http://schemas.microsoft.com/office/word/2012/wordml" xmlns:w16cex="http://schemas.microsoft.com/office/word/2018/wordml/cex" xmlns:w16cid="http://schemas.microsoft.com/office/word/2016/wordml/cid" xmlns:w16="http://schemas.microsoft.com/office/word/2018/wordml" xmlns:w16du="http://schemas.microsoft.com/office/word/2023/wordml/word16du" xmlns:w16sdtdh="http://schemas.microsoft.com/office/word/2020/wordml/sdtdatahash" xmlns:w16sdtfl="http://schemas.microsoft.com/office/word/2024/wordml/sdtformatlock" xmlns:w16se="http://schemas.microsoft.com/office/word/2015/wordml/symex" xmlns:wpg="http://schemas.microsoft.com/office/word/2010/wordprocessingGroup" xmlns:wpi="http://schemas.microsoft.com/office/word/2010/wordprocessingInk" xmlns:wne="http://schemas.microsoft.com/office/word/2006/wordml" xmlns:wps="http://schemas.microsoft.com/office/word/2010/wordprocessingShape" mc:Ignorable="w14 w15 w16se w16cid w16 w16cex w16sdtdh w16sdtfl w16du wp14">
   <w:p>
     <w:pPr>
       <w:pStyle w:val="Header"/>
@@ -3242,7 +3172,7 @@
 </file>
 
 <file path=word/numbering.xml><?xml version="1.0" encoding="utf-8"?>
-<w:numbering xmlns:wpc="http://schemas.microsoft.com/office/word/2010/wordprocessingCanvas" xmlns:cx="http://schemas.microsoft.com/office/drawing/2014/chartex" xmlns:cx1="http://schemas.microsoft.com/office/drawing/2015/9/8/chartex" xmlns:cx2="http://schemas.microsoft.com/office/drawing/2015/10/21/chartex" xmlns:cx3="http://schemas.microsoft.com/office/drawing/2016/5/9/chartex" xmlns:cx4="http://schemas.microsoft.com/office/drawing/2016/5/10/chartex" xmlns:cx5="http://schemas.microsoft.com/office/drawing/2016/5/11/chartex" xmlns:cx6="http://schemas.microsoft.com/office/drawing/2016/5/12/chartex" xmlns:cx7="http://schemas.microsoft.com/office/drawing/2016/5/13/chartex" xmlns:cx8="http://schemas.microsoft.com/office/drawing/2016/5/14/chartex" xmlns:mc="http://schemas.openxmlformats.org/markup-compatibility/2006" xmlns:aink="http://schemas.microsoft.com/office/drawing/2016/ink" xmlns:am3d="http://schemas.microsoft.com/office/drawing/2017/model3d" xmlns:o="urn:schemas-microsoft-com:office:office" xmlns:oel="http://schemas.microsoft.com/office/2019/extlst" xmlns:r="http://schemas.openxmlformats.org/officeDocument/2006/relationships" xmlns:m="http://schemas.openxmlformats.org/officeDocument/2006/math" xmlns:v="urn:schemas-microsoft-com:vml" xmlns:wp14="http://schemas.microsoft.com/office/word/2010/wordprocessingDrawing" xmlns:wp="http://schemas.openxmlformats.org/drawingml/2006/wordprocessingDrawing" xmlns:w10="urn:schemas-microsoft-com:office:word" xmlns:w="http://schemas.openxmlformats.org/wordprocessingml/2006/main" xmlns:w14="http://schemas.microsoft.com/office/word/2010/wordml" xmlns:w15="http://schemas.microsoft.com/office/word/2012/wordml" xmlns:w16cex="http://schemas.microsoft.com/office/word/2018/wordml/cex" xmlns:w16cid="http://schemas.microsoft.com/office/word/2016/wordml/cid" xmlns:w16="http://schemas.microsoft.com/office/word/2018/wordml" xmlns:w16sdtdh="http://schemas.microsoft.com/office/word/2020/wordml/sdtdatahash" xmlns:w16se="http://schemas.microsoft.com/office/word/2015/wordml/symex" xmlns:wpg="http://schemas.microsoft.com/office/word/2010/wordprocessingGroup" xmlns:wpi="http://schemas.microsoft.com/office/word/2010/wordprocessingInk" xmlns:wne="http://schemas.microsoft.com/office/word/2006/wordml" xmlns:wps="http://schemas.microsoft.com/office/word/2010/wordprocessingShape" mc:Ignorable="w14 w15 w16se w16cid w16 w16cex w16sdtdh wp14">
+<w:numbering xmlns:wpc="http://schemas.microsoft.com/office/word/2010/wordprocessingCanvas" xmlns:cx="http://schemas.microsoft.com/office/drawing/2014/chartex" xmlns:cx1="http://schemas.microsoft.com/office/drawing/2015/9/8/chartex" xmlns:cx2="http://schemas.microsoft.com/office/drawing/2015/10/21/chartex" xmlns:cx3="http://schemas.microsoft.com/office/drawing/2016/5/9/chartex" xmlns:cx4="http://schemas.microsoft.com/office/drawing/2016/5/10/chartex" xmlns:cx5="http://schemas.microsoft.com/office/drawing/2016/5/11/chartex" xmlns:cx6="http://schemas.microsoft.com/office/drawing/2016/5/12/chartex" xmlns:cx7="http://schemas.microsoft.com/office/drawing/2016/5/13/chartex" xmlns:cx8="http://schemas.microsoft.com/office/drawing/2016/5/14/chartex" xmlns:mc="http://schemas.openxmlformats.org/markup-compatibility/2006" xmlns:aink="http://schemas.microsoft.com/office/drawing/2016/ink" xmlns:am3d="http://schemas.microsoft.com/office/drawing/2017/model3d" xmlns:o="urn:schemas-microsoft-com:office:office" xmlns:oel="http://schemas.microsoft.com/office/2019/extlst" xmlns:r="http://schemas.openxmlformats.org/officeDocument/2006/relationships" xmlns:m="http://schemas.openxmlformats.org/officeDocument/2006/math" xmlns:v="urn:schemas-microsoft-com:vml" xmlns:wp14="http://schemas.microsoft.com/office/word/2010/wordprocessingDrawing" xmlns:wp="http://schemas.openxmlformats.org/drawingml/2006/wordprocessingDrawing" xmlns:w10="urn:schemas-microsoft-com:office:word" xmlns:w="http://schemas.openxmlformats.org/wordprocessingml/2006/main" xmlns:w14="http://schemas.microsoft.com/office/word/2010/wordml" xmlns:w15="http://schemas.microsoft.com/office/word/2012/wordml" xmlns:w16cex="http://schemas.microsoft.com/office/word/2018/wordml/cex" xmlns:w16cid="http://schemas.microsoft.com/office/word/2016/wordml/cid" xmlns:w16="http://schemas.microsoft.com/office/word/2018/wordml" xmlns:w16du="http://schemas.microsoft.com/office/word/2023/wordml/word16du" xmlns:w16sdtdh="http://schemas.microsoft.com/office/word/2020/wordml/sdtdatahash" xmlns:w16sdtfl="http://schemas.microsoft.com/office/word/2024/wordml/sdtformatlock" xmlns:w16se="http://schemas.microsoft.com/office/word/2015/wordml/symex" xmlns:wpg="http://schemas.microsoft.com/office/word/2010/wordprocessingGroup" xmlns:wpi="http://schemas.microsoft.com/office/word/2010/wordprocessingInk" xmlns:wne="http://schemas.microsoft.com/office/word/2006/wordml" xmlns:wps="http://schemas.microsoft.com/office/word/2010/wordprocessingShape" mc:Ignorable="w14 w15 w16se w16cid w16 w16cex w16sdtdh w16sdtfl w16du wp14">
   <w:abstractNum w:abstractNumId="0" w15:restartNumberingAfterBreak="0">
     <w:nsid w:val="0C391F0A"/>
     <w:multiLevelType w:val="hybridMultilevel"/>
@@ -4032,7 +3962,7 @@
 </file>
 
 <file path=word/styles.xml><?xml version="1.0" encoding="utf-8"?>
-<w:styles xmlns:mc="http://schemas.openxmlformats.org/markup-compatibility/2006" xmlns:r="http://schemas.openxmlformats.org/officeDocument/2006/relationships" xmlns:w="http://schemas.openxmlformats.org/wordprocessingml/2006/main" xmlns:w14="http://schemas.microsoft.com/office/word/2010/wordml" xmlns:w15="http://schemas.microsoft.com/office/word/2012/wordml" xmlns:w16cex="http://schemas.microsoft.com/office/word/2018/wordml/cex" xmlns:w16cid="http://schemas.microsoft.com/office/word/2016/wordml/cid" xmlns:w16="http://schemas.microsoft.com/office/word/2018/wordml" xmlns:w16sdtdh="http://schemas.microsoft.com/office/word/2020/wordml/sdtdatahash" xmlns:w16se="http://schemas.microsoft.com/office/word/2015/wordml/symex" mc:Ignorable="w14 w15 w16se w16cid w16 w16cex w16sdtdh">
+<w:styles xmlns:mc="http://schemas.openxmlformats.org/markup-compatibility/2006" xmlns:r="http://schemas.openxmlformats.org/officeDocument/2006/relationships" xmlns:w="http://schemas.openxmlformats.org/wordprocessingml/2006/main" xmlns:w14="http://schemas.microsoft.com/office/word/2010/wordml" xmlns:w15="http://schemas.microsoft.com/office/word/2012/wordml" xmlns:w16cex="http://schemas.microsoft.com/office/word/2018/wordml/cex" xmlns:w16cid="http://schemas.microsoft.com/office/word/2016/wordml/cid" xmlns:w16="http://schemas.microsoft.com/office/word/2018/wordml" xmlns:w16du="http://schemas.microsoft.com/office/word/2023/wordml/word16du" xmlns:w16sdtdh="http://schemas.microsoft.com/office/word/2020/wordml/sdtdatahash" xmlns:w16sdtfl="http://schemas.microsoft.com/office/word/2024/wordml/sdtformatlock" xmlns:w16se="http://schemas.microsoft.com/office/word/2015/wordml/symex" mc:Ignorable="w14 w15 w16se w16cid w16 w16cex w16sdtdh w16sdtfl w16du">
   <w:docDefaults>
     <w:rPrDefault>
       <w:rPr>
@@ -4429,6 +4359,11 @@
   <w:style w:type="paragraph" w:default="1" w:styleId="Normal">
     <w:name w:val="Normal"/>
     <w:qFormat/>
+    <w:rsid w:val="006F1FB3"/>
+    <w:pPr>
+      <w:spacing w:after="240"/>
+      <w:jc w:val="both"/>
+    </w:pPr>
   </w:style>
   <w:style w:type="paragraph" w:styleId="Heading1">
     <w:name w:val="heading 1"/>

</xml_diff>

<commit_message>
Updated the Dynamic Analysis Report secondary document (clarification of instrumentation activity)
</commit_message>
<xml_diff>
--- a/source/reference_documents/secondary_documents/implementation phase/Dynamic Analysis Report/Dynamic Analysis Report.docx
+++ b/source/reference_documents/secondary_documents/implementation phase/Dynamic Analysis Report/Dynamic Analysis Report.docx
@@ -31,7 +31,7 @@
         <w:t xml:space="preserve">Version </w:t>
       </w:r>
       <w:r>
-        <w:t>4</w:t>
+        <w:t>5</w:t>
       </w:r>
     </w:p>
     <w:p>
@@ -48,7 +48,7 @@
         <w:rPr>
           <w:noProof/>
         </w:rPr>
-        <w:t>8/15/25 9:18 AM</w:t>
+        <w:t>8/21/25 9:58 AM</w:t>
       </w:r>
       <w:r>
         <w:fldChar w:fldCharType="end"/>
@@ -198,13 +198,7 @@
         <w:t xml:space="preserve">This work </w:t>
       </w:r>
       <w:r>
-        <w:t xml:space="preserve">was </w:t>
-      </w:r>
-      <w:r>
-        <w:t xml:space="preserve">originally </w:t>
-      </w:r>
-      <w:r>
-        <w:t xml:space="preserve">created by </w:t>
+        <w:t xml:space="preserve">was originally created by </w:t>
       </w:r>
       <w:r>
         <w:rPr>
@@ -354,9 +348,9 @@
           <w:noProof/>
         </w:rPr>
         <w:drawing>
-          <wp:inline distT="0" distB="0" distL="0" distR="0" wp14:anchorId="4A5E8C84" wp14:editId="4550AD15">
-            <wp:extent cx="5943600" cy="1906437"/>
-            <wp:effectExtent l="0" t="0" r="0" b="0"/>
+          <wp:inline distT="0" distB="0" distL="0" distR="0" wp14:anchorId="4A5E8C84" wp14:editId="761173F5">
+            <wp:extent cx="5943597" cy="1906437"/>
+            <wp:effectExtent l="0" t="0" r="635" b="0"/>
             <wp:docPr id="1" name="Picture 1"/>
             <wp:cNvGraphicFramePr>
               <a:graphicFrameLocks xmlns:a="http://schemas.openxmlformats.org/drawingml/2006/main" noChangeAspect="1"/>
@@ -383,7 +377,7 @@
                   <pic:spPr>
                     <a:xfrm>
                       <a:off x="0" y="0"/>
-                      <a:ext cx="5943600" cy="1906437"/>
+                      <a:ext cx="5943597" cy="1906437"/>
                     </a:xfrm>
                     <a:prstGeom prst="rect">
                       <a:avLst/>
@@ -662,7 +656,7 @@
           <w:noProof/>
         </w:rPr>
         <w:drawing>
-          <wp:inline distT="0" distB="0" distL="0" distR="0" wp14:anchorId="5244CBE1" wp14:editId="590238FA">
+          <wp:inline distT="0" distB="0" distL="0" distR="0" wp14:anchorId="5244CBE1" wp14:editId="47D3C689">
             <wp:extent cx="3793530" cy="4397047"/>
             <wp:effectExtent l="0" t="0" r="3810" b="0"/>
             <wp:docPr id="2" name="Picture 2"/>
@@ -953,6 +947,22 @@
             </w:pPr>
             <w:r>
               <w:t>Updated build file</w:t>
+            </w:r>
+          </w:p>
+          <w:p>
+            <w:pPr>
+              <w:widowControl w:val="0"/>
+              <w:pBdr>
+                <w:top w:val="nil"/>
+                <w:left w:val="nil"/>
+                <w:bottom w:val="nil"/>
+                <w:right w:val="nil"/>
+                <w:between w:val="nil"/>
+              </w:pBdr>
+              <w:spacing w:after="0" w:line="240" w:lineRule="auto"/>
+            </w:pPr>
+            <w:r>
+              <w:t>Element test</w:t>
             </w:r>
           </w:p>
         </w:tc>
@@ -1073,6 +1083,14 @@
           </w:tcPr>
           <w:p>
             <w:pPr>
+              <w:spacing w:after="0"/>
+            </w:pPr>
+            <w:r>
+              <w:t>Security SME</w:t>
+            </w:r>
+          </w:p>
+          <w:p>
+            <w:pPr>
               <w:widowControl w:val="0"/>
               <w:pBdr>
                 <w:top w:val="nil"/>
@@ -1088,11 +1106,7 @@
               </w:rPr>
             </w:pPr>
             <w:r>
-              <w:rPr>
-                <w:b/>
-                <w:bCs/>
-              </w:rPr>
-              <w:t>none</w:t>
+              <w:t>DevOps SME</w:t>
             </w:r>
           </w:p>
         </w:tc>
@@ -1108,9 +1122,9 @@
           <w:noProof/>
         </w:rPr>
         <w:drawing>
-          <wp:inline distT="0" distB="0" distL="0" distR="0" wp14:anchorId="53B2FBF4" wp14:editId="293E6054">
-            <wp:extent cx="4571831" cy="4391025"/>
-            <wp:effectExtent l="0" t="0" r="635" b="3175"/>
+          <wp:inline distT="0" distB="0" distL="0" distR="0" wp14:anchorId="53B2FBF4" wp14:editId="294A10A5">
+            <wp:extent cx="4603140" cy="4421094"/>
+            <wp:effectExtent l="0" t="0" r="0" b="0"/>
             <wp:docPr id="3" name="Picture 3"/>
             <wp:cNvGraphicFramePr>
               <a:graphicFrameLocks xmlns:a="http://schemas.openxmlformats.org/drawingml/2006/main" noChangeAspect="1"/>
@@ -1137,7 +1151,7 @@
                   <pic:spPr>
                     <a:xfrm>
                       <a:off x="0" y="0"/>
-                      <a:ext cx="4603140" cy="4421096"/>
+                      <a:ext cx="4603140" cy="4421094"/>
                     </a:xfrm>
                     <a:prstGeom prst="rect">
                       <a:avLst/>
@@ -1214,10 +1228,13 @@
         <w:t>t</w:t>
       </w:r>
       <w:r>
-        <w:t xml:space="preserve">he build system </w:t>
-      </w:r>
-      <w:r>
-        <w:t xml:space="preserve">takes the </w:t>
+        <w:t xml:space="preserve">he </w:t>
+      </w:r>
+      <w:r>
+        <w:t xml:space="preserve">Security SME and Devops SME </w:t>
+      </w:r>
+      <w:r>
+        <w:t xml:space="preserve">take the </w:t>
       </w:r>
       <w:r>
         <w:rPr>
@@ -1227,10 +1244,17 @@
         <w:t>Element</w:t>
       </w:r>
       <w:r>
+        <w:rPr>
+          <w:b/>
+          <w:bCs/>
+        </w:rPr>
+        <w:t xml:space="preserve"> Test</w:t>
+      </w:r>
+      <w:r>
         <w:t xml:space="preserve"> and </w:t>
       </w:r>
       <w:r>
-        <w:t>creates</w:t>
+        <w:t>create</w:t>
       </w:r>
       <w:r>
         <w:t xml:space="preserve"> </w:t>
@@ -1267,17 +1291,53 @@
         <w:t>lement</w:t>
       </w:r>
       <w:r>
+        <w:rPr>
+          <w:b/>
+          <w:bCs/>
+        </w:rPr>
+        <w:t xml:space="preserve"> </w:t>
+      </w:r>
+      <w:r>
+        <w:rPr>
+          <w:b/>
+          <w:bCs/>
+        </w:rPr>
+        <w:t>T</w:t>
+      </w:r>
+      <w:r>
+        <w:rPr>
+          <w:b/>
+          <w:bCs/>
+        </w:rPr>
+        <w:t>est</w:t>
+      </w:r>
+      <w:r>
         <w:t>.</w:t>
       </w:r>
     </w:p>
     <w:p>
       <w:pPr>
+        <w:ind w:left="720" w:hanging="720"/>
         <w:rPr>
           <w:sz w:val="32"/>
           <w:szCs w:val="32"/>
         </w:rPr>
       </w:pPr>
       <w:r>
+        <w:rPr>
+          <w:b/>
+          <w:bCs/>
+          <w:color w:val="0070C0"/>
+        </w:rPr>
+        <w:t>Note:</w:t>
+      </w:r>
+      <w:r>
+        <w:tab/>
+      </w:r>
+      <w:r>
+        <w:t>In some cases, the Security SME may perform this alone. The process may even be fully automated.</w:t>
+      </w:r>
+      <w:r>
         <w:br w:type="page"/>
       </w:r>
     </w:p>
@@ -1292,7 +1352,7 @@
     </w:p>
     <w:tbl>
       <w:tblPr>
-        <w:tblW w:w="4130" w:type="dxa"/>
+        <w:tblW w:w="4490" w:type="dxa"/>
         <w:tblBorders>
           <w:top w:val="single" w:sz="8" w:space="0" w:color="000000"/>
           <w:left w:val="single" w:sz="8" w:space="0" w:color="000000"/>
@@ -1306,7 +1366,7 @@
       </w:tblPr>
       <w:tblGrid>
         <w:gridCol w:w="1520"/>
-        <w:gridCol w:w="2610"/>
+        <w:gridCol w:w="2970"/>
       </w:tblGrid>
       <w:tr>
         <w:tc>
@@ -1348,7 +1408,7 @@
         </w:tc>
         <w:tc>
           <w:tcPr>
-            <w:tcW w:w="2610" w:type="dxa"/>
+            <w:tcW w:w="2970" w:type="dxa"/>
             <w:tcMar>
               <w:top w:w="100" w:type="dxa"/>
               <w:left w:w="100" w:type="dxa"/>
@@ -1370,6 +1430,9 @@
             </w:pPr>
             <w:r>
               <w:t>Instrumented element</w:t>
+            </w:r>
+            <w:r>
+              <w:t xml:space="preserve"> test</w:t>
             </w:r>
           </w:p>
         </w:tc>
@@ -1414,7 +1477,7 @@
         </w:tc>
         <w:tc>
           <w:tcPr>
-            <w:tcW w:w="2610" w:type="dxa"/>
+            <w:tcW w:w="2970" w:type="dxa"/>
             <w:tcMar>
               <w:top w:w="100" w:type="dxa"/>
               <w:left w:w="100" w:type="dxa"/>
@@ -1480,7 +1543,7 @@
         </w:tc>
         <w:tc>
           <w:tcPr>
-            <w:tcW w:w="2610" w:type="dxa"/>
+            <w:tcW w:w="2970" w:type="dxa"/>
             <w:tcMar>
               <w:top w:w="100" w:type="dxa"/>
               <w:left w:w="100" w:type="dxa"/>
@@ -1525,8 +1588,8 @@
           <w:noProof/>
         </w:rPr>
         <w:drawing>
-          <wp:inline distT="0" distB="0" distL="0" distR="0" wp14:anchorId="187C55E4" wp14:editId="2F1A9121">
-            <wp:extent cx="3669350" cy="4392883"/>
+          <wp:inline distT="0" distB="0" distL="0" distR="0" wp14:anchorId="187C55E4" wp14:editId="3E73BCFE">
+            <wp:extent cx="3669349" cy="4392883"/>
             <wp:effectExtent l="0" t="0" r="1270" b="1905"/>
             <wp:docPr id="4" name="Picture 4"/>
             <wp:cNvGraphicFramePr>
@@ -1554,7 +1617,7 @@
                   <pic:spPr>
                     <a:xfrm>
                       <a:off x="0" y="0"/>
-                      <a:ext cx="3669350" cy="4392883"/>
+                      <a:ext cx="3669349" cy="4392883"/>
                     </a:xfrm>
                     <a:prstGeom prst="rect">
                       <a:avLst/>
@@ -1620,6 +1683,13 @@
           <w:bCs/>
         </w:rPr>
         <w:t>Element</w:t>
+      </w:r>
+      <w:r>
+        <w:rPr>
+          <w:b/>
+          <w:bCs/>
+        </w:rPr>
+        <w:t xml:space="preserve"> Test</w:t>
       </w:r>
       <w:r>
         <w:t>. The</w:t>
@@ -2179,16 +2249,7 @@
         <w:t xml:space="preserve"> artifact is </w:t>
       </w:r>
       <w:r>
-        <w:t>JSON</w:t>
-      </w:r>
-      <w:r>
-        <w:t>-</w:t>
-      </w:r>
-      <w:r>
-        <w:t>encoded</w:t>
-      </w:r>
-      <w:r>
-        <w:t xml:space="preserve"> </w:t>
+        <w:t xml:space="preserve">JSON-encoded </w:t>
       </w:r>
       <w:r>
         <w:t>Static Analysis Results Interchange Format (</w:t>

</xml_diff>

<commit_message>
Updated the Dynamic Analysis Report secondary document (issues go to threat prioritization process rathe than directly to the issue tracking system)
</commit_message>
<xml_diff>
--- a/source/reference_documents/secondary_documents/implementation phase/Dynamic Analysis Report/Dynamic Analysis Report.docx
+++ b/source/reference_documents/secondary_documents/implementation phase/Dynamic Analysis Report/Dynamic Analysis Report.docx
@@ -31,7 +31,7 @@
         <w:t xml:space="preserve">Version </w:t>
       </w:r>
       <w:r>
-        <w:t>5</w:t>
+        <w:t>6</w:t>
       </w:r>
     </w:p>
     <w:p>
@@ -48,7 +48,7 @@
         <w:rPr>
           <w:noProof/>
         </w:rPr>
-        <w:t>8/21/25 9:58 AM</w:t>
+        <w:t>8/25/25 8:03 AM</w:t>
       </w:r>
       <w:r>
         <w:fldChar w:fldCharType="end"/>
@@ -348,8 +348,8 @@
           <w:noProof/>
         </w:rPr>
         <w:drawing>
-          <wp:inline distT="0" distB="0" distL="0" distR="0" wp14:anchorId="4A5E8C84" wp14:editId="761173F5">
-            <wp:extent cx="5943597" cy="1906437"/>
+          <wp:inline distT="0" distB="0" distL="0" distR="0" wp14:anchorId="4A5E8C84" wp14:editId="7E1127A7">
+            <wp:extent cx="5943597" cy="1906436"/>
             <wp:effectExtent l="0" t="0" r="635" b="0"/>
             <wp:docPr id="1" name="Picture 1"/>
             <wp:cNvGraphicFramePr>
@@ -377,7 +377,7 @@
                   <pic:spPr>
                     <a:xfrm>
                       <a:off x="0" y="0"/>
-                      <a:ext cx="5943597" cy="1906437"/>
+                      <a:ext cx="5943597" cy="1906436"/>
                     </a:xfrm>
                     <a:prstGeom prst="rect">
                       <a:avLst/>
@@ -656,7 +656,7 @@
           <w:noProof/>
         </w:rPr>
         <w:drawing>
-          <wp:inline distT="0" distB="0" distL="0" distR="0" wp14:anchorId="5244CBE1" wp14:editId="47D3C689">
+          <wp:inline distT="0" distB="0" distL="0" distR="0" wp14:anchorId="5244CBE1" wp14:editId="0E0201F1">
             <wp:extent cx="3793530" cy="4397047"/>
             <wp:effectExtent l="0" t="0" r="3810" b="0"/>
             <wp:docPr id="2" name="Picture 2"/>
@@ -1333,8 +1333,6 @@
       </w:r>
       <w:r>
         <w:tab/>
-      </w:r>
-      <w:r>
         <w:t>In some cases, the Security SME may perform this alone. The process may even be fully automated.</w:t>
       </w:r>
       <w:r>
@@ -2017,9 +2015,9 @@
           <w:noProof/>
         </w:rPr>
         <w:drawing>
-          <wp:inline distT="0" distB="0" distL="0" distR="0" wp14:anchorId="418682C9" wp14:editId="1ED32A9F">
-            <wp:extent cx="4581236" cy="4367559"/>
-            <wp:effectExtent l="0" t="0" r="0" b="1270"/>
+          <wp:inline distT="0" distB="0" distL="0" distR="0" wp14:anchorId="418682C9" wp14:editId="4D248B54">
+            <wp:extent cx="4597185" cy="4374187"/>
+            <wp:effectExtent l="0" t="0" r="635" b="0"/>
             <wp:docPr id="5" name="Picture 5"/>
             <wp:cNvGraphicFramePr>
               <a:graphicFrameLocks xmlns:a="http://schemas.openxmlformats.org/drawingml/2006/main" noChangeAspect="1"/>
@@ -2032,7 +2030,7 @@
                     <pic:cNvPicPr/>
                   </pic:nvPicPr>
                   <pic:blipFill>
-                    <a:blip r:embed="rId12">
+                    <a:blip r:embed="rId12" cstate="print">
                       <a:extLst>
                         <a:ext uri="{28A0092B-C50C-407E-A947-70E740481C1C}">
                           <a14:useLocalDpi xmlns:a14="http://schemas.microsoft.com/office/drawing/2010/main" val="0"/>
@@ -2046,7 +2044,7 @@
                   <pic:spPr>
                     <a:xfrm>
                       <a:off x="0" y="0"/>
-                      <a:ext cx="4597185" cy="4382764"/>
+                      <a:ext cx="4597185" cy="4374187"/>
                     </a:xfrm>
                     <a:prstGeom prst="rect">
                       <a:avLst/>
@@ -2145,142 +2143,10 @@
         <w:t>ion</w:t>
       </w:r>
       <w:r>
-        <w:t>. For any such anomalous behavior, an issue will be created in the issue tracking system.</w:t>
-      </w:r>
-      <w:r>
-        <w:t xml:space="preserve"> A </w:t>
-      </w:r>
-      <w:r>
-        <w:rPr>
-          <w:b/>
-          <w:bCs/>
-        </w:rPr>
-        <w:t>D</w:t>
-      </w:r>
-      <w:r>
-        <w:rPr>
-          <w:b/>
-          <w:bCs/>
-        </w:rPr>
-        <w:t xml:space="preserve">ynamic </w:t>
-      </w:r>
-      <w:r>
-        <w:rPr>
-          <w:b/>
-          <w:bCs/>
-        </w:rPr>
-        <w:t>A</w:t>
-      </w:r>
-      <w:r>
-        <w:rPr>
-          <w:b/>
-          <w:bCs/>
-        </w:rPr>
-        <w:t xml:space="preserve">nalysis </w:t>
-      </w:r>
-      <w:r>
-        <w:rPr>
-          <w:b/>
-          <w:bCs/>
-        </w:rPr>
-        <w:t>R</w:t>
-      </w:r>
-      <w:r>
-        <w:rPr>
-          <w:b/>
-          <w:bCs/>
-        </w:rPr>
-        <w:t>eport</w:t>
-      </w:r>
-      <w:r>
-        <w:t xml:space="preserve"> will be </w:t>
-      </w:r>
-      <w:r>
-        <w:t>generated</w:t>
-      </w:r>
-      <w:r>
-        <w:t>.</w:t>
-      </w:r>
-    </w:p>
-    <w:p>
-      <w:pPr>
-        <w:pStyle w:val="Heading3"/>
-      </w:pPr>
-      <w:r>
-        <w:t>Identified Issues</w:t>
-      </w:r>
-    </w:p>
-    <w:p>
-      <w:r>
-        <w:t xml:space="preserve">The </w:t>
-      </w:r>
-      <w:r>
-        <w:t xml:space="preserve">recommended form of the </w:t>
-      </w:r>
-      <w:r>
-        <w:rPr>
-          <w:b/>
-          <w:bCs/>
-        </w:rPr>
-        <w:t>I</w:t>
-      </w:r>
-      <w:r>
-        <w:rPr>
-          <w:b/>
-          <w:bCs/>
-        </w:rPr>
-        <w:t xml:space="preserve">dentified </w:t>
-      </w:r>
-      <w:r>
-        <w:rPr>
-          <w:b/>
-          <w:bCs/>
-        </w:rPr>
-        <w:t>I</w:t>
-      </w:r>
-      <w:r>
-        <w:rPr>
-          <w:b/>
-          <w:bCs/>
-        </w:rPr>
-        <w:t>ssues</w:t>
-      </w:r>
-      <w:r>
-        <w:t xml:space="preserve"> artifact is </w:t>
-      </w:r>
-      <w:r>
-        <w:t xml:space="preserve">JSON-encoded </w:t>
-      </w:r>
-      <w:r>
-        <w:t>Static Analysis Results Interchange Format (</w:t>
-      </w:r>
-      <w:r>
-        <w:rPr>
-          <w:b/>
-          <w:bCs/>
-        </w:rPr>
-        <w:t>SARIF</w:t>
-      </w:r>
-      <w:r>
-        <w:t>)</w:t>
-      </w:r>
-      <w:r>
-        <w:t>.</w:t>
-      </w:r>
-      <w:r>
-        <w:t xml:space="preserve"> </w:t>
-      </w:r>
-      <w:r>
-        <w:t xml:space="preserve">This document </w:t>
-      </w:r>
-      <w:r>
-        <w:t>assumes</w:t>
-      </w:r>
-      <w:r>
-        <w:t xml:space="preserve"> SARIF </w:t>
-      </w:r>
-      <w:r>
-        <w:t>version 2.1.0</w:t>
+        <w:t xml:space="preserve">. </w:t>
+      </w:r>
+      <w:r>
+        <w:t>Identified Issues are sent to the threat ranking process</w:t>
       </w:r>
       <w:r>
         <w:t xml:space="preserve"> </w:t>
@@ -2292,6 +2158,207 @@
           <w:color w:val="0070C0"/>
           <w:vertAlign w:val="superscript"/>
         </w:rPr>
+        <w:t>[</w:t>
+      </w:r>
+      <w:r>
+        <w:rPr>
+          <w:b/>
+          <w:bCs/>
+          <w:color w:val="0070C0"/>
+          <w:vertAlign w:val="superscript"/>
+        </w:rPr>
+        <w:t>6</w:t>
+      </w:r>
+      <w:r>
+        <w:rPr>
+          <w:b/>
+          <w:bCs/>
+          <w:color w:val="0070C0"/>
+          <w:vertAlign w:val="superscript"/>
+        </w:rPr>
+        <w:t>]</w:t>
+      </w:r>
+      <w:r>
+        <w:t>.</w:t>
+      </w:r>
+      <w:r>
+        <w:t xml:space="preserve"> A </w:t>
+      </w:r>
+      <w:r>
+        <w:rPr>
+          <w:b/>
+          <w:bCs/>
+        </w:rPr>
+        <w:t>D</w:t>
+      </w:r>
+      <w:r>
+        <w:rPr>
+          <w:b/>
+          <w:bCs/>
+        </w:rPr>
+        <w:t xml:space="preserve">ynamic </w:t>
+      </w:r>
+      <w:r>
+        <w:rPr>
+          <w:b/>
+          <w:bCs/>
+        </w:rPr>
+        <w:t>A</w:t>
+      </w:r>
+      <w:r>
+        <w:rPr>
+          <w:b/>
+          <w:bCs/>
+        </w:rPr>
+        <w:t xml:space="preserve">nalysis </w:t>
+      </w:r>
+      <w:r>
+        <w:rPr>
+          <w:b/>
+          <w:bCs/>
+        </w:rPr>
+        <w:t>R</w:t>
+      </w:r>
+      <w:r>
+        <w:rPr>
+          <w:b/>
+          <w:bCs/>
+        </w:rPr>
+        <w:t>eport</w:t>
+      </w:r>
+      <w:r>
+        <w:t xml:space="preserve"> will be </w:t>
+      </w:r>
+      <w:r>
+        <w:t>generated</w:t>
+      </w:r>
+      <w:r>
+        <w:t>.</w:t>
+      </w:r>
+    </w:p>
+    <w:p>
+      <w:pPr>
+        <w:ind w:left="720" w:hanging="720"/>
+        <w:rPr>
+          <w:sz w:val="32"/>
+          <w:szCs w:val="32"/>
+        </w:rPr>
+      </w:pPr>
+      <w:r>
+        <w:rPr>
+          <w:b/>
+          <w:bCs/>
+          <w:color w:val="0070C0"/>
+        </w:rPr>
+        <w:t>Note:</w:t>
+      </w:r>
+      <w:r>
+        <w:tab/>
+      </w:r>
+      <w:r>
+        <w:t>Depending on the element scope and nature of the identified issue, identified issues may be entered into the issue tracking system</w:t>
+      </w:r>
+      <w:r>
+        <w:t xml:space="preserve"> </w:t>
+      </w:r>
+      <w:r>
+        <w:t>directly.</w:t>
+      </w:r>
+      <w:r>
+        <w:br w:type="page"/>
+      </w:r>
+    </w:p>
+    <w:p>
+      <w:pPr>
+        <w:pStyle w:val="Heading3"/>
+      </w:pPr>
+      <w:r>
+        <w:lastRenderedPageBreak/>
+        <w:t>Identified Issues</w:t>
+      </w:r>
+    </w:p>
+    <w:p>
+      <w:r>
+        <w:t xml:space="preserve">The </w:t>
+      </w:r>
+      <w:r>
+        <w:t xml:space="preserve">recommended form of the </w:t>
+      </w:r>
+      <w:r>
+        <w:rPr>
+          <w:b/>
+          <w:bCs/>
+        </w:rPr>
+        <w:t>I</w:t>
+      </w:r>
+      <w:r>
+        <w:rPr>
+          <w:b/>
+          <w:bCs/>
+        </w:rPr>
+        <w:t xml:space="preserve">dentified </w:t>
+      </w:r>
+      <w:r>
+        <w:rPr>
+          <w:b/>
+          <w:bCs/>
+        </w:rPr>
+        <w:t>I</w:t>
+      </w:r>
+      <w:r>
+        <w:rPr>
+          <w:b/>
+          <w:bCs/>
+        </w:rPr>
+        <w:t>ssues</w:t>
+      </w:r>
+      <w:r>
+        <w:t xml:space="preserve"> artifact is </w:t>
+      </w:r>
+      <w:r>
+        <w:t xml:space="preserve">JSON-encoded </w:t>
+      </w:r>
+      <w:r>
+        <w:t>Static Analysis Results Interchange Format (</w:t>
+      </w:r>
+      <w:r>
+        <w:rPr>
+          <w:b/>
+          <w:bCs/>
+        </w:rPr>
+        <w:t>SARIF</w:t>
+      </w:r>
+      <w:r>
+        <w:t>)</w:t>
+      </w:r>
+      <w:r>
+        <w:t>.</w:t>
+      </w:r>
+      <w:r>
+        <w:t xml:space="preserve"> </w:t>
+      </w:r>
+      <w:r>
+        <w:t xml:space="preserve">This document </w:t>
+      </w:r>
+      <w:r>
+        <w:t>assumes</w:t>
+      </w:r>
+      <w:r>
+        <w:t xml:space="preserve"> SARIF </w:t>
+      </w:r>
+      <w:r>
+        <w:t>version 2.1.0</w:t>
+      </w:r>
+      <w:r>
+        <w:t xml:space="preserve"> </w:t>
+      </w:r>
+      <w:r>
+        <w:rPr>
+          <w:b/>
+          <w:bCs/>
+          <w:color w:val="0070C0"/>
+          <w:vertAlign w:val="superscript"/>
+        </w:rPr>
         <w:t xml:space="preserve">[1] </w:t>
       </w:r>
       <w:r>
@@ -2306,7 +2373,6 @@
         <w:pStyle w:val="Heading3"/>
       </w:pPr>
       <w:r>
-        <w:lastRenderedPageBreak/>
         <w:t xml:space="preserve">Dynamic Analysis </w:t>
       </w:r>
       <w:r>
@@ -2636,7 +2702,17 @@
       </w:r>
     </w:p>
     <w:p>
-      <w:r>
+      <w:pPr>
+        <w:spacing w:after="0"/>
+        <w:jc w:val="left"/>
+      </w:pPr>
+      <w:r>
+        <w:br w:type="page"/>
+      </w:r>
+    </w:p>
+    <w:p>
+      <w:r>
+        <w:lastRenderedPageBreak/>
         <w:t>The element properties further describe the element. Each includes:</w:t>
       </w:r>
     </w:p>
@@ -2741,12 +2817,6 @@
     </w:p>
     <w:p>
       <w:r>
-        <w:br w:type="page"/>
-      </w:r>
-    </w:p>
-    <w:p>
-      <w:r>
-        <w:lastRenderedPageBreak/>
         <w:t>The analysis results (one or more) describe the issues exposed by the analysis. Each includes:</w:t>
       </w:r>
     </w:p>
@@ -3031,6 +3101,40 @@
           <w:color w:val="000000" w:themeColor="text1"/>
         </w:rPr>
         <w:t>document)</w:t>
+      </w:r>
+    </w:p>
+    <w:p>
+      <w:pPr>
+        <w:pStyle w:val="ListParagraph"/>
+        <w:numPr>
+          <w:ilvl w:val="0"/>
+          <w:numId w:val="1"/>
+        </w:numPr>
+        <w:ind w:left="360"/>
+        <w:rPr>
+          <w:color w:val="000000" w:themeColor="text1"/>
+        </w:rPr>
+      </w:pPr>
+      <w:r>
+        <w:rPr>
+          <w:b/>
+          <w:bCs/>
+          <w:color w:val="000000" w:themeColor="text1"/>
+        </w:rPr>
+        <w:t>Threat Prioritization Plan</w:t>
+      </w:r>
+      <w:r>
+        <w:rPr>
+          <w:b/>
+          <w:bCs/>
+        </w:rPr>
+        <w:t xml:space="preserve"> </w:t>
+      </w:r>
+      <w:r>
+        <w:t>(AVC</w:t>
+      </w:r>
+      <w:r>
+        <w:t>DL secondary document)</w:t>
       </w:r>
     </w:p>
     <w:p/>

</xml_diff>

<commit_message>
Updated the Dynamic Analysis Report secondary document (issues go to threat prioritization process rather than threat ranking)
</commit_message>
<xml_diff>
--- a/source/reference_documents/secondary_documents/implementation phase/Dynamic Analysis Report/Dynamic Analysis Report.docx
+++ b/source/reference_documents/secondary_documents/implementation phase/Dynamic Analysis Report/Dynamic Analysis Report.docx
@@ -31,7 +31,7 @@
         <w:t xml:space="preserve">Version </w:t>
       </w:r>
       <w:r>
-        <w:t>6</w:t>
+        <w:t>7</w:t>
       </w:r>
     </w:p>
     <w:p>
@@ -48,7 +48,7 @@
         <w:rPr>
           <w:noProof/>
         </w:rPr>
-        <w:t>8/25/25 8:03 AM</w:t>
+        <w:t>8/26/25 7:24 AM</w:t>
       </w:r>
       <w:r>
         <w:fldChar w:fldCharType="end"/>
@@ -656,7 +656,7 @@
           <w:noProof/>
         </w:rPr>
         <w:drawing>
-          <wp:inline distT="0" distB="0" distL="0" distR="0" wp14:anchorId="5244CBE1" wp14:editId="0E0201F1">
+          <wp:inline distT="0" distB="0" distL="0" distR="0" wp14:anchorId="5244CBE1" wp14:editId="56105510">
             <wp:extent cx="3793530" cy="4397047"/>
             <wp:effectExtent l="0" t="0" r="3810" b="0"/>
             <wp:docPr id="2" name="Picture 2"/>
@@ -1586,8 +1586,8 @@
           <w:noProof/>
         </w:rPr>
         <w:drawing>
-          <wp:inline distT="0" distB="0" distL="0" distR="0" wp14:anchorId="187C55E4" wp14:editId="3E73BCFE">
-            <wp:extent cx="3669349" cy="4392883"/>
+          <wp:inline distT="0" distB="0" distL="0" distR="0" wp14:anchorId="187C55E4" wp14:editId="5A7F769F">
+            <wp:extent cx="3669030" cy="4392501"/>
             <wp:effectExtent l="0" t="0" r="1270" b="1905"/>
             <wp:docPr id="4" name="Picture 4"/>
             <wp:cNvGraphicFramePr>
@@ -1615,7 +1615,7 @@
                   <pic:spPr>
                     <a:xfrm>
                       <a:off x="0" y="0"/>
-                      <a:ext cx="3669349" cy="4392883"/>
+                      <a:ext cx="3669693" cy="4393295"/>
                     </a:xfrm>
                     <a:prstGeom prst="rect">
                       <a:avLst/>
@@ -2015,9 +2015,9 @@
           <w:noProof/>
         </w:rPr>
         <w:drawing>
-          <wp:inline distT="0" distB="0" distL="0" distR="0" wp14:anchorId="418682C9" wp14:editId="4D248B54">
-            <wp:extent cx="4597185" cy="4374187"/>
-            <wp:effectExtent l="0" t="0" r="635" b="0"/>
+          <wp:inline distT="0" distB="0" distL="0" distR="0" wp14:anchorId="418682C9" wp14:editId="32CF4ED7">
+            <wp:extent cx="4700980" cy="4391025"/>
+            <wp:effectExtent l="0" t="0" r="0" b="3175"/>
             <wp:docPr id="5" name="Picture 5"/>
             <wp:cNvGraphicFramePr>
               <a:graphicFrameLocks xmlns:a="http://schemas.openxmlformats.org/drawingml/2006/main" noChangeAspect="1"/>
@@ -2044,7 +2044,7 @@
                   <pic:spPr>
                     <a:xfrm>
                       <a:off x="0" y="0"/>
-                      <a:ext cx="4597185" cy="4374187"/>
+                      <a:ext cx="4703637" cy="4393507"/>
                     </a:xfrm>
                     <a:prstGeom prst="rect">
                       <a:avLst/>
@@ -2146,10 +2146,13 @@
         <w:t xml:space="preserve">. </w:t>
       </w:r>
       <w:r>
-        <w:t>Identified Issues are sent to the threat ranking process</w:t>
-      </w:r>
-      <w:r>
-        <w:t xml:space="preserve"> </w:t>
+        <w:t xml:space="preserve">Identified Issues are sent to the threat </w:t>
+      </w:r>
+      <w:r>
+        <w:t>prioritization</w:t>
+      </w:r>
+      <w:r>
+        <w:t xml:space="preserve"> process </w:t>
       </w:r>
       <w:r>
         <w:rPr>
@@ -2254,8 +2257,6 @@
       </w:r>
       <w:r>
         <w:tab/>
-      </w:r>
-      <w:r>
         <w:t>Depending on the element scope and nature of the identified issue, identified issues may be entered into the issue tracking system</w:t>
       </w:r>
       <w:r>

</xml_diff>

<commit_message>
updated the dynamic analysis workflow diagram / update the Dynamic Analysis Report / updated the Dynamic Analysis Triage Procedure
</commit_message>
<xml_diff>
--- a/source/reference_documents/secondary_documents/implementation phase/Dynamic Analysis Report/Dynamic Analysis Report.docx
+++ b/source/reference_documents/secondary_documents/implementation phase/Dynamic Analysis Report/Dynamic Analysis Report.docx
@@ -31,7 +31,7 @@
         <w:t xml:space="preserve">Version </w:t>
       </w:r>
       <w:r>
-        <w:t>7</w:t>
+        <w:t>8</w:t>
       </w:r>
     </w:p>
     <w:p>
@@ -48,7 +48,7 @@
         <w:rPr>
           <w:noProof/>
         </w:rPr>
-        <w:t>8/26/25 7:24 AM</w:t>
+        <w:t>2/16/26 9:15 AM</w:t>
       </w:r>
       <w:r>
         <w:fldChar w:fldCharType="end"/>
@@ -64,15 +64,53 @@
     </w:p>
     <w:p>
       <w:pPr>
+        <w:tabs>
+          <w:tab w:val="right" w:pos="1080"/>
+          <w:tab w:val="left" w:pos="1260"/>
+        </w:tabs>
         <w:spacing w:after="0"/>
-      </w:pPr>
+        <w:rPr>
+          <w:lang w:val="en-US"/>
+        </w:rPr>
+      </w:pPr>
+      <w:r>
+        <w:rPr>
+          <w:lang w:val="en-US"/>
+        </w:rPr>
+        <w:tab/>
+        <w:t>Process:</w:t>
+      </w:r>
+      <w:r>
+        <w:rPr>
+          <w:lang w:val="en-US"/>
+        </w:rPr>
+        <w:tab/>
+        <w:t>Charles Wilson</w:t>
+      </w:r>
+    </w:p>
+    <w:p>
+      <w:pPr>
+        <w:tabs>
+          <w:tab w:val="right" w:pos="1080"/>
+          <w:tab w:val="left" w:pos="1260"/>
+        </w:tabs>
+        <w:spacing w:after="0"/>
+      </w:pPr>
+      <w:r>
+        <w:rPr>
+          <w:lang w:val="en-US"/>
+        </w:rPr>
+        <w:tab/>
+        <w:t>Report:</w:t>
+      </w:r>
+      <w:r>
+        <w:rPr>
+          <w:lang w:val="en-US"/>
+        </w:rPr>
+        <w:tab/>
+      </w:r>
       <w:r>
         <w:t>Matthew Bourdua</w:t>
-      </w:r>
-    </w:p>
-    <w:p>
-      <w:r>
-        <w:t>Charles Wilson</w:t>
       </w:r>
     </w:p>
     <w:p>
@@ -139,45 +177,7 @@
         <w:t>cyber</w:t>
       </w:r>
       <w:r>
-        <w:t xml:space="preserve">security-related feedback in the development of software for use within safety-critical, cyber-physical systems for certification of compliance to standards such as </w:t>
-      </w:r>
-      <w:r>
-        <w:rPr>
-          <w:b/>
-          <w:bCs/>
-        </w:rPr>
-        <w:t>ISO</w:t>
-      </w:r>
-      <w:r>
-        <w:rPr>
-          <w:b/>
-          <w:bCs/>
-        </w:rPr>
-        <w:t>/SAE</w:t>
-      </w:r>
-      <w:r>
-        <w:rPr>
-          <w:b/>
-          <w:bCs/>
-        </w:rPr>
-        <w:t xml:space="preserve"> 21434</w:t>
-      </w:r>
-      <w:r>
-        <w:t xml:space="preserve"> and </w:t>
-      </w:r>
-      <w:r>
-        <w:rPr>
-          <w:b/>
-          <w:bCs/>
-        </w:rPr>
-        <w:t xml:space="preserve">ISO </w:t>
-      </w:r>
-      <w:r>
-        <w:rPr>
-          <w:b/>
-          <w:bCs/>
-        </w:rPr>
-        <w:t>26262</w:t>
+        <w:t>security-related feedback in the development of software for use within safety-critical, cyber-physical systems</w:t>
       </w:r>
       <w:r>
         <w:t>.</w:t>
@@ -348,8 +348,8 @@
           <w:noProof/>
         </w:rPr>
         <w:drawing>
-          <wp:inline distT="0" distB="0" distL="0" distR="0" wp14:anchorId="4A5E8C84" wp14:editId="7E1127A7">
-            <wp:extent cx="5943597" cy="1906436"/>
+          <wp:inline distT="0" distB="0" distL="0" distR="0" wp14:anchorId="4A5E8C84" wp14:editId="32881A88">
+            <wp:extent cx="5943597" cy="1847187"/>
             <wp:effectExtent l="0" t="0" r="635" b="0"/>
             <wp:docPr id="1" name="Picture 1"/>
             <wp:cNvGraphicFramePr>
@@ -377,7 +377,7 @@
                   <pic:spPr>
                     <a:xfrm>
                       <a:off x="0" y="0"/>
-                      <a:ext cx="5943597" cy="1906436"/>
+                      <a:ext cx="5943597" cy="1847187"/>
                     </a:xfrm>
                     <a:prstGeom prst="rect">
                       <a:avLst/>
@@ -656,7 +656,7 @@
           <w:noProof/>
         </w:rPr>
         <w:drawing>
-          <wp:inline distT="0" distB="0" distL="0" distR="0" wp14:anchorId="5244CBE1" wp14:editId="56105510">
+          <wp:inline distT="0" distB="0" distL="0" distR="0" wp14:anchorId="5244CBE1" wp14:editId="0AD89992">
             <wp:extent cx="3793530" cy="4397047"/>
             <wp:effectExtent l="0" t="0" r="3810" b="0"/>
             <wp:docPr id="2" name="Picture 2"/>
@@ -2015,9 +2015,9 @@
           <w:noProof/>
         </w:rPr>
         <w:drawing>
-          <wp:inline distT="0" distB="0" distL="0" distR="0" wp14:anchorId="418682C9" wp14:editId="32CF4ED7">
-            <wp:extent cx="4700980" cy="4391025"/>
-            <wp:effectExtent l="0" t="0" r="0" b="3175"/>
+          <wp:inline distT="0" distB="0" distL="0" distR="0" wp14:anchorId="418682C9" wp14:editId="33136A0F">
+            <wp:extent cx="5053874" cy="4390930"/>
+            <wp:effectExtent l="0" t="0" r="0" b="3810"/>
             <wp:docPr id="5" name="Picture 5"/>
             <wp:cNvGraphicFramePr>
               <a:graphicFrameLocks xmlns:a="http://schemas.openxmlformats.org/drawingml/2006/main" noChangeAspect="1"/>
@@ -2044,7 +2044,7 @@
                   <pic:spPr>
                     <a:xfrm>
                       <a:off x="0" y="0"/>
-                      <a:ext cx="4703637" cy="4393507"/>
+                      <a:ext cx="5075827" cy="4410003"/>
                     </a:xfrm>
                     <a:prstGeom prst="rect">
                       <a:avLst/>

</xml_diff>